<commit_message>
docs: update Mini Program chapter to OneNET direct + Railway as alt method
</commit_message>
<xml_diff>
--- a/Claude_Files/docs/WPT无线充电系统-从零搭建全指南.docx
+++ b/Claude_Files/docs/WPT无线充电系统-从零搭建全指南.docx
@@ -15523,28 +15523,42 @@
           <w:sz w:val="28"/>
           <w:szCs w:val="28"/>
         </w:rPr>
-        <w:t xml:space="preserve">7.1 架构</w:t>
-      </w:r>
-    </w:p>
-    <w:p/>
-    <w:p>
-      <w:pPr>
-        <w:pBdr>
-          <w:left w:val="single" w:color="2B579A" w:sz="12" w:space="8"/>
-        </w:pBdr>
+        <w:t xml:space="preserve">7.1 当前架构 (V5.0)</w:t>
+      </w:r>
+    </w:p>
+    <w:p/>
+    <w:p>
+      <w:pPr>
         <w:spacing w:line="360"/>
-        <w:ind w:left="360"/>
-      </w:pPr>
-      <w:r>
-        <w:rPr>
-          <w:rFonts w:ascii="SimSun" w:cs="SimSun" w:eastAsia="SimSun" w:hAnsi="SimSun"/>
-          <w:i/>
-          <w:iCs/>
-          <w:color w:val="555555"/>
-          <w:sz w:val="20"/>
-          <w:szCs w:val="20"/>
-        </w:rPr>
-        <w:t xml:space="preserve">微信小程序真机对 WebSocket 有严格限制——只能用 `wss://` 连接已备案域名。EMQX 公共 Broker 不在白名单内, 直连必挂。</w:t>
+      </w:pPr>
+      <w:r>
+        <w:rPr>
+          <w:rFonts w:ascii="SimSun" w:cs="SimSun" w:eastAsia="SimSun" w:hAnsi="SimSun"/>
+          <w:color w:val="333333"/>
+          <w:sz w:val="22"/>
+          <w:szCs w:val="22"/>
+        </w:rPr>
+        <w:t xml:space="preserve">V5.0 起小程序</w:t>
+      </w:r>
+      <w:r>
+        <w:rPr>
+          <w:rFonts w:ascii="SimSun" w:cs="SimSun" w:eastAsia="SimSun" w:hAnsi="SimSun"/>
+          <w:b/>
+          <w:bCs/>
+          <w:color w:val="333333"/>
+          <w:sz w:val="22"/>
+          <w:szCs w:val="22"/>
+        </w:rPr>
+        <w:t xml:space="preserve">直连 OneNET HTTP API</w:t>
+      </w:r>
+      <w:r>
+        <w:rPr>
+          <w:rFonts w:ascii="SimSun" w:cs="SimSun" w:eastAsia="SimSun" w:hAnsi="SimSun"/>
+          <w:color w:val="333333"/>
+          <w:sz w:val="22"/>
+          <w:szCs w:val="22"/>
+        </w:rPr>
+        <w:t xml:space="preserve">，与网页端完全相同的后端逻辑：</w:t>
       </w:r>
     </w:p>
     <w:p/>
@@ -15561,7 +15575,7 @@
           <w:sz w:val="19"/>
           <w:szCs w:val="19"/>
         </w:rPr>
-        <w:t xml:space="preserve">小程序 ──HTTPS── Railway 桥接 ──MQTT── EMQX ── ESP8266 ── STM32</w:t>
+        <w:t xml:space="preserve">小程序 ──HTTPS── OneNET API (iot-api.heclouds.com) ──MQTT── ESP8266 ── STM32</w:t>
       </w:r>
     </w:p>
     <w:p/>
@@ -15576,7 +15590,7 @@
           <w:sz w:val="22"/>
           <w:szCs w:val="22"/>
         </w:rPr>
-        <w:t xml:space="preserve">桥接服务器 (`bridge.cjs`) 做 HTTP ↔ MQTT 转换:</w:t>
+        <w:t xml:space="preserve">不再依赖 Railway、EMQX 或任何中间桥接服务器。小程序和网页端共用同一套：</w:t>
       </w:r>
     </w:p>
     <w:p>
@@ -15590,7 +15604,7 @@
           <w:sz w:val="22"/>
           <w:szCs w:val="22"/>
         </w:rPr>
-        <w:t xml:space="preserve">- `GET /data` → 返回最新遥测 (含 `state` 字段, 0/1/2/3)</w:t>
+        <w:t xml:space="preserve">- `GET /thingmodel/query-device-property` 读取数据</w:t>
       </w:r>
     </w:p>
     <w:p>
@@ -15604,7 +15618,35 @@
           <w:sz w:val="22"/>
           <w:szCs w:val="22"/>
         </w:rPr>
-        <w:t xml:space="preserve">- `POST /cmd` → 下发控制指令</w:t>
+        <w:t xml:space="preserve">- `POST /thingmodel/set-device-property` 下发指令 (Switch / SetFreq)</w:t>
+      </w:r>
+    </w:p>
+    <w:p>
+      <w:pPr>
+        <w:spacing w:line="360"/>
+      </w:pPr>
+      <w:r>
+        <w:rPr>
+          <w:rFonts w:ascii="SimSun" w:cs="SimSun" w:eastAsia="SimSun" w:hAnsi="SimSun"/>
+          <w:color w:val="333333"/>
+          <w:sz w:val="22"/>
+          <w:szCs w:val="22"/>
+        </w:rPr>
+        <w:t xml:space="preserve">- 同一套 Token 鉴权</w:t>
+      </w:r>
+    </w:p>
+    <w:p>
+      <w:pPr>
+        <w:spacing w:line="360"/>
+      </w:pPr>
+      <w:r>
+        <w:rPr>
+          <w:rFonts w:ascii="SimSun" w:cs="SimSun" w:eastAsia="SimSun" w:hAnsi="SimSun"/>
+          <w:color w:val="333333"/>
+          <w:sz w:val="22"/>
+          <w:szCs w:val="22"/>
+        </w:rPr>
+        <w:t xml:space="preserve">- 同一套 fromCloud/toCloud 转换逻辑</w:t>
       </w:r>
     </w:p>
     <w:p/>
@@ -15622,7 +15664,7 @@
           <w:sz w:val="28"/>
           <w:szCs w:val="28"/>
         </w:rPr>
-        <w:t xml:space="preserve">7.2 方案演进</w:t>
+        <w:t xml:space="preserve">7.2 数据流与轮询</w:t>
       </w:r>
     </w:p>
     <w:p/>
@@ -15672,7 +15714,7 @@
                 <w:sz w:val="20"/>
                 <w:szCs w:val="20"/>
               </w:rPr>
-              <w:t xml:space="preserve">阶段</w:t>
+              <w:t xml:space="preserve">数据类型</w:t>
             </w:r>
           </w:p>
         </w:tc>
@@ -15703,7 +15745,7 @@
                 <w:sz w:val="20"/>
                 <w:szCs w:val="20"/>
               </w:rPr>
-              <w:t xml:space="preserve">方案</w:t>
+              <w:t xml:space="preserve">刷新间隔</w:t>
             </w:r>
           </w:p>
         </w:tc>
@@ -15734,7 +15776,7 @@
                 <w:sz w:val="20"/>
                 <w:szCs w:val="20"/>
               </w:rPr>
-              <w:t xml:space="preserve">结果</w:t>
+              <w:t xml:space="preserve">对标网页端</w:t>
             </w:r>
           </w:p>
         </w:tc>
@@ -15767,7 +15809,7 @@
                 <w:sz w:val="20"/>
                 <w:szCs w:val="20"/>
               </w:rPr>
-              <w:t xml:space="preserve">1</w:t>
+              <w:t xml:space="preserve">V/I/F 遥测</w:t>
             </w:r>
           </w:p>
         </w:tc>
@@ -15798,7 +15840,7 @@
                 <w:sz w:val="20"/>
                 <w:szCs w:val="20"/>
               </w:rPr>
-              <w:t xml:space="preserve">WebSocket 直连 EMQX</w:t>
+              <w:t xml:space="preserve">5 秒</w:t>
             </w:r>
           </w:p>
         </w:tc>
@@ -15829,7 +15871,7 @@
                 <w:sz w:val="20"/>
                 <w:szCs w:val="20"/>
               </w:rPr>
-              <w:t xml:space="preserve">微信真机拒 TLS 证书 ❌</w:t>
+              <w:t xml:space="preserve">网页首页</w:t>
             </w:r>
           </w:p>
         </w:tc>
@@ -15862,7 +15904,7 @@
                 <w:sz w:val="20"/>
                 <w:szCs w:val="20"/>
               </w:rPr>
-              <w:t xml:space="preserve">2</w:t>
+              <w:t xml:space="preserve">Switch/SetFreq 控制状态</w:t>
             </w:r>
           </w:p>
         </w:tc>
@@ -15893,7 +15935,7 @@
                 <w:sz w:val="20"/>
                 <w:szCs w:val="20"/>
               </w:rPr>
-              <w:t xml:space="preserve">HTTP 轮询 + ngrok 隧道</w:t>
+              <w:t xml:space="preserve">60 秒 + 手动刷新按钮</w:t>
             </w:r>
           </w:p>
         </w:tc>
@@ -15924,7 +15966,7 @@
                 <w:sz w:val="20"/>
                 <w:szCs w:val="20"/>
               </w:rPr>
-              <w:t xml:space="preserve">DNS 污染 + 免费限流 ❌</w:t>
+              <w:t xml:space="preserve">网页控制页</w:t>
             </w:r>
           </w:p>
         </w:tc>
@@ -15957,7 +15999,7 @@
                 <w:sz w:val="20"/>
                 <w:szCs w:val="20"/>
               </w:rPr>
-              <w:t xml:space="preserve">3</w:t>
+              <w:t xml:space="preserve">乐观锁</w:t>
             </w:r>
           </w:p>
         </w:tc>
@@ -15988,7 +16030,7 @@
                 <w:sz w:val="20"/>
                 <w:szCs w:val="20"/>
               </w:rPr>
-              <w:t xml:space="preserve">Railway 桥接 ✅</w:t>
+              <w:t xml:space="preserve">5 秒</w:t>
             </w:r>
           </w:p>
         </w:tc>
@@ -16019,7 +16061,7 @@
                 <w:sz w:val="20"/>
                 <w:szCs w:val="20"/>
               </w:rPr>
-              <w:t xml:space="preserve">稳定 HTTPS, 免费额度够用</w:t>
+              <w:t xml:space="preserve">防止云端旧值回弹</w:t>
             </w:r>
           </w:p>
         </w:tc>
@@ -16041,38 +16083,10 @@
           <w:sz w:val="28"/>
           <w:szCs w:val="28"/>
         </w:rPr>
-        <w:t xml:space="preserve">7.3 小程序功能</w:t>
-      </w:r>
-    </w:p>
-    <w:p/>
-    <w:p>
-      <w:pPr>
-        <w:spacing w:line="360"/>
-      </w:pPr>
-      <w:r>
-        <w:rPr>
-          <w:rFonts w:ascii="SimSun" w:cs="SimSun" w:eastAsia="SimSun" w:hAnsi="SimSun"/>
-          <w:color w:val="333333"/>
-          <w:sz w:val="22"/>
-          <w:szCs w:val="22"/>
-        </w:rPr>
-        <w:t xml:space="preserve">- 深色/浅色双主题 (☀/🌙 切换, 偏好持久化)</w:t>
-      </w:r>
-    </w:p>
-    <w:p>
-      <w:pPr>
-        <w:spacing w:line="360"/>
-      </w:pPr>
-      <w:r>
-        <w:rPr>
-          <w:rFonts w:ascii="SimSun" w:cs="SimSun" w:eastAsia="SimSun" w:hAnsi="SimSun"/>
-          <w:color w:val="333333"/>
-          <w:sz w:val="22"/>
-          <w:szCs w:val="22"/>
-        </w:rPr>
-        <w:t xml:space="preserve">- 状态/电压/电流/频率四卡片</w:t>
-      </w:r>
-    </w:p>
+        <w:t xml:space="preserve">7.3 功能特性</w:t>
+      </w:r>
+    </w:p>
+    <w:p/>
     <w:p>
       <w:pPr>
         <w:spacing w:line="360"/>
@@ -16095,16 +16109,16 @@
           <w:sz w:val="22"/>
           <w:szCs w:val="22"/>
         </w:rPr>
-        <w:t xml:space="preserve">频率设置</w:t>
-      </w:r>
-      <w:r>
-        <w:rPr>
-          <w:rFonts w:ascii="SimSun" w:cs="SimSun" w:eastAsia="SimSun" w:hAnsi="SimSun"/>
-          <w:color w:val="333333"/>
-          <w:sz w:val="22"/>
-          <w:szCs w:val="22"/>
-        </w:rPr>
-        <w:t xml:space="preserve">卡片: swiper 滑动选频 (只显示实际可达值) + 确认按钮</w:t>
+        <w:t xml:space="preserve">双主题</w:t>
+      </w:r>
+      <w:r>
+        <w:rPr>
+          <w:rFonts w:ascii="SimSun" w:cs="SimSun" w:eastAsia="SimSun" w:hAnsi="SimSun"/>
+          <w:color w:val="333333"/>
+          <w:sz w:val="22"/>
+          <w:szCs w:val="22"/>
+        </w:rPr>
+        <w:t xml:space="preserve">: 深色/浅色 (CSS 变量, localStorage 持久化)</w:t>
       </w:r>
     </w:p>
     <w:p>
@@ -16129,16 +16143,118 @@
           <w:sz w:val="22"/>
           <w:szCs w:val="22"/>
         </w:rPr>
-        <w:t xml:space="preserve">启停按钮</w:t>
-      </w:r>
-      <w:r>
-        <w:rPr>
-          <w:rFonts w:ascii="SimSun" w:cs="SimSun" w:eastAsia="SimSun" w:hAnsi="SimSun"/>
-          <w:color w:val="333333"/>
-          <w:sz w:val="22"/>
-          <w:szCs w:val="22"/>
-        </w:rPr>
-        <w:t xml:space="preserve">: 渐变背景+光晕阴影</w:t>
+        <w:t xml:space="preserve">启停开关</w:t>
+      </w:r>
+      <w:r>
+        <w:rPr>
+          <w:rFonts w:ascii="SimSun" w:cs="SimSun" w:eastAsia="SimSun" w:hAnsi="SimSun"/>
+          <w:color w:val="333333"/>
+          <w:sz w:val="22"/>
+          <w:szCs w:val="22"/>
+        </w:rPr>
+        <w:t xml:space="preserve">: `switch` 组件 toggle，与网页控制页完全一致</w:t>
+      </w:r>
+    </w:p>
+    <w:p>
+      <w:pPr>
+        <w:spacing w:line="360"/>
+      </w:pPr>
+      <w:r>
+        <w:rPr>
+          <w:rFonts w:ascii="SimSun" w:cs="SimSun" w:eastAsia="SimSun" w:hAnsi="SimSun"/>
+          <w:color w:val="333333"/>
+          <w:sz w:val="22"/>
+          <w:szCs w:val="22"/>
+        </w:rPr>
+        <w:t xml:space="preserve">- </w:t>
+      </w:r>
+      <w:r>
+        <w:rPr>
+          <w:rFonts w:ascii="SimSun" w:cs="SimSun" w:eastAsia="SimSun" w:hAnsi="SimSun"/>
+          <w:b/>
+          <w:bCs/>
+          <w:color w:val="333333"/>
+          <w:sz w:val="22"/>
+          <w:szCs w:val="22"/>
+        </w:rPr>
+        <w:t xml:space="preserve">频率设置</w:t>
+      </w:r>
+      <w:r>
+        <w:rPr>
+          <w:rFonts w:ascii="SimSun" w:cs="SimSun" w:eastAsia="SimSun" w:hAnsi="SimSun"/>
+          <w:color w:val="333333"/>
+          <w:sz w:val="22"/>
+          <w:szCs w:val="22"/>
+        </w:rPr>
+        <w:t xml:space="preserve">: swiper 滑动选频 (只显示可达值) + 确认按钮，发送 `kHz × 1000` Hz</w:t>
+      </w:r>
+    </w:p>
+    <w:p>
+      <w:pPr>
+        <w:spacing w:line="360"/>
+      </w:pPr>
+      <w:r>
+        <w:rPr>
+          <w:rFonts w:ascii="SimSun" w:cs="SimSun" w:eastAsia="SimSun" w:hAnsi="SimSun"/>
+          <w:color w:val="333333"/>
+          <w:sz w:val="22"/>
+          <w:szCs w:val="22"/>
+        </w:rPr>
+        <w:t xml:space="preserve">- </w:t>
+      </w:r>
+      <w:r>
+        <w:rPr>
+          <w:rFonts w:ascii="SimSun" w:cs="SimSun" w:eastAsia="SimSun" w:hAnsi="SimSun"/>
+          <w:b/>
+          <w:bCs/>
+          <w:color w:val="333333"/>
+          <w:sz w:val="22"/>
+          <w:szCs w:val="22"/>
+        </w:rPr>
+        <w:t xml:space="preserve">实时数据卡</w:t>
+      </w:r>
+      <w:r>
+        <w:rPr>
+          <w:rFonts w:ascii="SimSun" w:cs="SimSun" w:eastAsia="SimSun" w:hAnsi="SimSun"/>
+          <w:color w:val="333333"/>
+          <w:sz w:val="22"/>
+          <w:szCs w:val="22"/>
+        </w:rPr>
+        <w:t xml:space="preserve">: 电压/电流/频率，对标网页首页</w:t>
+      </w:r>
+    </w:p>
+    <w:p>
+      <w:pPr>
+        <w:spacing w:line="360"/>
+      </w:pPr>
+      <w:r>
+        <w:rPr>
+          <w:rFonts w:ascii="SimSun" w:cs="SimSun" w:eastAsia="SimSun" w:hAnsi="SimSun"/>
+          <w:color w:val="333333"/>
+          <w:sz w:val="22"/>
+          <w:szCs w:val="22"/>
+        </w:rPr>
+        <w:t xml:space="preserve">- </w:t>
+      </w:r>
+      <w:r>
+        <w:rPr>
+          <w:rFonts w:ascii="SimSun" w:cs="SimSun" w:eastAsia="SimSun" w:hAnsi="SimSun"/>
+          <w:b/>
+          <w:bCs/>
+          <w:color w:val="333333"/>
+          <w:sz w:val="22"/>
+          <w:szCs w:val="22"/>
+        </w:rPr>
+        <w:t xml:space="preserve">手动刷新</w:t>
+      </w:r>
+      <w:r>
+        <w:rPr>
+          <w:rFonts w:ascii="SimSun" w:cs="SimSun" w:eastAsia="SimSun" w:hAnsi="SimSun"/>
+          <w:color w:val="333333"/>
+          <w:sz w:val="22"/>
+          <w:szCs w:val="22"/>
+        </w:rPr>
+        <w:t xml:space="preserve">: 标题栏 ⟳ 按钮，旋转动画，一键拉取最新状态</w:t>
       </w:r>
     </w:p>
     <w:p/>
@@ -16156,7 +16272,7 @@
           <w:sz w:val="28"/>
           <w:szCs w:val="28"/>
         </w:rPr>
-        <w:t xml:space="preserve">7.4 已知局限</w:t>
+        <w:t xml:space="preserve">7.4 方案演进 (历史参考)</w:t>
       </w:r>
     </w:p>
     <w:p/>
@@ -16171,27 +16287,724 @@
           <w:sz w:val="22"/>
           <w:szCs w:val="22"/>
         </w:rPr>
-        <w:t xml:space="preserve">小程序目前依赖 Railway 桥接服务器。如果 Railway 免费额度用完或服务休眠, 小程序会不可用。日常使用推荐</w:t>
-      </w:r>
-      <w:r>
-        <w:rPr>
-          <w:rFonts w:ascii="SimSun" w:cs="SimSun" w:eastAsia="SimSun" w:hAnsi="SimSun"/>
+        <w:t xml:space="preserve">V5.0 之前经历了两代架构：</w:t>
+      </w:r>
+    </w:p>
+    <w:p/>
+    <w:p/>
+    <w:tbl>
+      <w:tblPr>
+        <w:tblW w:type="dxa" w:w="9072"/>
+        <w:tblBorders>
+          <w:top w:val="single" w:color="auto" w:sz="4"/>
+          <w:left w:val="single" w:color="auto" w:sz="4"/>
+          <w:bottom w:val="single" w:color="auto" w:sz="4"/>
+          <w:right w:val="single" w:color="auto" w:sz="4"/>
+          <w:insideH w:val="single" w:color="auto" w:sz="4"/>
+          <w:insideV w:val="single" w:color="auto" w:sz="4"/>
+        </w:tblBorders>
+      </w:tblPr>
+      <w:tblGrid>
+        <w:gridCol w:w="2268"/>
+        <w:gridCol w:w="2268"/>
+        <w:gridCol w:w="2268"/>
+        <w:gridCol w:w="2268"/>
+      </w:tblGrid>
+      <w:tr>
+        <w:tc>
+          <w:tcPr>
+            <w:tcW w:type="dxa" w:w="2268"/>
+            <w:tcBorders>
+              <w:top w:val="single" w:color="CCCCCC" w:sz="1"/>
+              <w:left w:val="single" w:color="CCCCCC" w:sz="1"/>
+              <w:bottom w:val="single" w:color="CCCCCC" w:sz="1"/>
+              <w:right w:val="single" w:color="CCCCCC" w:sz="1"/>
+            </w:tcBorders>
+            <w:shd w:fill="D5E8F0" w:val="clear"/>
+            <w:tcMar>
+              <w:top w:type="dxa" w:w="60"/>
+              <w:left w:type="dxa" w:w="100"/>
+              <w:bottom w:type="dxa" w:w="60"/>
+              <w:right w:type="dxa" w:w="100"/>
+            </w:tcMar>
+          </w:tcPr>
+          <w:p>
+            <w:r>
+              <w:rPr>
+                <w:rFonts w:ascii="SimSun" w:cs="SimSun" w:eastAsia="SimSun" w:hAnsi="SimSun"/>
+                <w:b/>
+                <w:bCs/>
+                <w:color w:val="333333"/>
+                <w:sz w:val="20"/>
+                <w:szCs w:val="20"/>
+              </w:rPr>
+              <w:t xml:space="preserve">阶段</w:t>
+            </w:r>
+          </w:p>
+        </w:tc>
+        <w:tc>
+          <w:tcPr>
+            <w:tcW w:type="dxa" w:w="2268"/>
+            <w:tcBorders>
+              <w:top w:val="single" w:color="CCCCCC" w:sz="1"/>
+              <w:left w:val="single" w:color="CCCCCC" w:sz="1"/>
+              <w:bottom w:val="single" w:color="CCCCCC" w:sz="1"/>
+              <w:right w:val="single" w:color="CCCCCC" w:sz="1"/>
+            </w:tcBorders>
+            <w:shd w:fill="D5E8F0" w:val="clear"/>
+            <w:tcMar>
+              <w:top w:type="dxa" w:w="60"/>
+              <w:left w:type="dxa" w:w="100"/>
+              <w:bottom w:type="dxa" w:w="60"/>
+              <w:right w:type="dxa" w:w="100"/>
+            </w:tcMar>
+          </w:tcPr>
+          <w:p>
+            <w:r>
+              <w:rPr>
+                <w:rFonts w:ascii="SimSun" w:cs="SimSun" w:eastAsia="SimSun" w:hAnsi="SimSun"/>
+                <w:b/>
+                <w:bCs/>
+                <w:color w:val="333333"/>
+                <w:sz w:val="20"/>
+                <w:szCs w:val="20"/>
+              </w:rPr>
+              <w:t xml:space="preserve">方案</w:t>
+            </w:r>
+          </w:p>
+        </w:tc>
+        <w:tc>
+          <w:tcPr>
+            <w:tcW w:type="dxa" w:w="2268"/>
+            <w:tcBorders>
+              <w:top w:val="single" w:color="CCCCCC" w:sz="1"/>
+              <w:left w:val="single" w:color="CCCCCC" w:sz="1"/>
+              <w:bottom w:val="single" w:color="CCCCCC" w:sz="1"/>
+              <w:right w:val="single" w:color="CCCCCC" w:sz="1"/>
+            </w:tcBorders>
+            <w:shd w:fill="D5E8F0" w:val="clear"/>
+            <w:tcMar>
+              <w:top w:type="dxa" w:w="60"/>
+              <w:left w:type="dxa" w:w="100"/>
+              <w:bottom w:type="dxa" w:w="60"/>
+              <w:right w:type="dxa" w:w="100"/>
+            </w:tcMar>
+          </w:tcPr>
+          <w:p>
+            <w:r>
+              <w:rPr>
+                <w:rFonts w:ascii="SimSun" w:cs="SimSun" w:eastAsia="SimSun" w:hAnsi="SimSun"/>
+                <w:b/>
+                <w:bCs/>
+                <w:color w:val="333333"/>
+                <w:sz w:val="20"/>
+                <w:szCs w:val="20"/>
+              </w:rPr>
+              <w:t xml:space="preserve">结果</w:t>
+            </w:r>
+          </w:p>
+        </w:tc>
+        <w:tc>
+          <w:tcPr>
+            <w:tcW w:type="dxa" w:w="2268"/>
+            <w:tcBorders>
+              <w:top w:val="single" w:color="CCCCCC" w:sz="1"/>
+              <w:left w:val="single" w:color="CCCCCC" w:sz="1"/>
+              <w:bottom w:val="single" w:color="CCCCCC" w:sz="1"/>
+              <w:right w:val="single" w:color="CCCCCC" w:sz="1"/>
+            </w:tcBorders>
+            <w:shd w:fill="D5E8F0" w:val="clear"/>
+            <w:tcMar>
+              <w:top w:type="dxa" w:w="60"/>
+              <w:left w:type="dxa" w:w="100"/>
+              <w:bottom w:type="dxa" w:w="60"/>
+              <w:right w:type="dxa" w:w="100"/>
+            </w:tcMar>
+          </w:tcPr>
+          <w:p>
+            <w:r>
+              <w:rPr>
+                <w:rFonts w:ascii="SimSun" w:cs="SimSun" w:eastAsia="SimSun" w:hAnsi="SimSun"/>
+                <w:b/>
+                <w:bCs/>
+                <w:color w:val="333333"/>
+                <w:sz w:val="20"/>
+                <w:szCs w:val="20"/>
+              </w:rPr>
+              <w:t xml:space="preserve">放弃原因</w:t>
+            </w:r>
+          </w:p>
+        </w:tc>
+      </w:tr>
+      <w:tr>
+        <w:tc>
+          <w:tcPr>
+            <w:tcW w:type="dxa" w:w="2268"/>
+            <w:tcBorders>
+              <w:top w:val="single" w:color="CCCCCC" w:sz="1"/>
+              <w:left w:val="single" w:color="CCCCCC" w:sz="1"/>
+              <w:bottom w:val="single" w:color="CCCCCC" w:sz="1"/>
+              <w:right w:val="single" w:color="CCCCCC" w:sz="1"/>
+            </w:tcBorders>
+            <w:tcMar>
+              <w:top w:type="dxa" w:w="60"/>
+              <w:left w:type="dxa" w:w="100"/>
+              <w:bottom w:type="dxa" w:w="60"/>
+              <w:right w:type="dxa" w:w="100"/>
+            </w:tcMar>
+          </w:tcPr>
+          <w:p>
+            <w:pPr>
+              <w:spacing w:line="288"/>
+            </w:pPr>
+            <w:r>
+              <w:rPr>
+                <w:rFonts w:ascii="SimSun" w:cs="SimSun" w:eastAsia="SimSun" w:hAnsi="SimSun"/>
+                <w:color w:val="333333"/>
+                <w:sz w:val="20"/>
+                <w:szCs w:val="20"/>
+              </w:rPr>
+              <w:t xml:space="preserve">V1</w:t>
+            </w:r>
+          </w:p>
+        </w:tc>
+        <w:tc>
+          <w:tcPr>
+            <w:tcW w:type="dxa" w:w="2268"/>
+            <w:tcBorders>
+              <w:top w:val="single" w:color="CCCCCC" w:sz="1"/>
+              <w:left w:val="single" w:color="CCCCCC" w:sz="1"/>
+              <w:bottom w:val="single" w:color="CCCCCC" w:sz="1"/>
+              <w:right w:val="single" w:color="CCCCCC" w:sz="1"/>
+            </w:tcBorders>
+            <w:tcMar>
+              <w:top w:type="dxa" w:w="60"/>
+              <w:left w:type="dxa" w:w="100"/>
+              <w:bottom w:type="dxa" w:w="60"/>
+              <w:right w:type="dxa" w:w="100"/>
+            </w:tcMar>
+          </w:tcPr>
+          <w:p>
+            <w:pPr>
+              <w:spacing w:line="288"/>
+            </w:pPr>
+            <w:r>
+              <w:rPr>
+                <w:rFonts w:ascii="SimSun" w:cs="SimSun" w:eastAsia="SimSun" w:hAnsi="SimSun"/>
+                <w:color w:val="333333"/>
+                <w:sz w:val="20"/>
+                <w:szCs w:val="20"/>
+              </w:rPr>
+              <w:t xml:space="preserve">WebSocket 直连 EMQX</w:t>
+            </w:r>
+          </w:p>
+        </w:tc>
+        <w:tc>
+          <w:tcPr>
+            <w:tcW w:type="dxa" w:w="2268"/>
+            <w:tcBorders>
+              <w:top w:val="single" w:color="CCCCCC" w:sz="1"/>
+              <w:left w:val="single" w:color="CCCCCC" w:sz="1"/>
+              <w:bottom w:val="single" w:color="CCCCCC" w:sz="1"/>
+              <w:right w:val="single" w:color="CCCCCC" w:sz="1"/>
+            </w:tcBorders>
+            <w:tcMar>
+              <w:top w:type="dxa" w:w="60"/>
+              <w:left w:type="dxa" w:w="100"/>
+              <w:bottom w:type="dxa" w:w="60"/>
+              <w:right w:type="dxa" w:w="100"/>
+            </w:tcMar>
+          </w:tcPr>
+          <w:p>
+            <w:pPr>
+              <w:spacing w:line="288"/>
+            </w:pPr>
+            <w:r>
+              <w:rPr>
+                <w:rFonts w:ascii="SimSun" w:cs="SimSun" w:eastAsia="SimSun" w:hAnsi="SimSun"/>
+                <w:color w:val="333333"/>
+                <w:sz w:val="20"/>
+                <w:szCs w:val="20"/>
+              </w:rPr>
+              <w:t xml:space="preserve">❌</w:t>
+            </w:r>
+          </w:p>
+        </w:tc>
+        <w:tc>
+          <w:tcPr>
+            <w:tcW w:type="dxa" w:w="2268"/>
+            <w:tcBorders>
+              <w:top w:val="single" w:color="CCCCCC" w:sz="1"/>
+              <w:left w:val="single" w:color="CCCCCC" w:sz="1"/>
+              <w:bottom w:val="single" w:color="CCCCCC" w:sz="1"/>
+              <w:right w:val="single" w:color="CCCCCC" w:sz="1"/>
+            </w:tcBorders>
+            <w:tcMar>
+              <w:top w:type="dxa" w:w="60"/>
+              <w:left w:type="dxa" w:w="100"/>
+              <w:bottom w:type="dxa" w:w="60"/>
+              <w:right w:type="dxa" w:w="100"/>
+            </w:tcMar>
+          </w:tcPr>
+          <w:p>
+            <w:pPr>
+              <w:spacing w:line="288"/>
+            </w:pPr>
+            <w:r>
+              <w:rPr>
+                <w:rFonts w:ascii="SimSun" w:cs="SimSun" w:eastAsia="SimSun" w:hAnsi="SimSun"/>
+                <w:color w:val="333333"/>
+                <w:sz w:val="20"/>
+                <w:szCs w:val="20"/>
+              </w:rPr>
+              <w:t xml:space="preserve">微信真机拒 EMQX TLS 证书</w:t>
+            </w:r>
+          </w:p>
+        </w:tc>
+      </w:tr>
+      <w:tr>
+        <w:tc>
+          <w:tcPr>
+            <w:tcW w:type="dxa" w:w="2268"/>
+            <w:tcBorders>
+              <w:top w:val="single" w:color="CCCCCC" w:sz="1"/>
+              <w:left w:val="single" w:color="CCCCCC" w:sz="1"/>
+              <w:bottom w:val="single" w:color="CCCCCC" w:sz="1"/>
+              <w:right w:val="single" w:color="CCCCCC" w:sz="1"/>
+            </w:tcBorders>
+            <w:tcMar>
+              <w:top w:type="dxa" w:w="60"/>
+              <w:left w:type="dxa" w:w="100"/>
+              <w:bottom w:type="dxa" w:w="60"/>
+              <w:right w:type="dxa" w:w="100"/>
+            </w:tcMar>
+          </w:tcPr>
+          <w:p>
+            <w:pPr>
+              <w:spacing w:line="288"/>
+            </w:pPr>
+            <w:r>
+              <w:rPr>
+                <w:rFonts w:ascii="SimSun" w:cs="SimSun" w:eastAsia="SimSun" w:hAnsi="SimSun"/>
+                <w:color w:val="333333"/>
+                <w:sz w:val="20"/>
+                <w:szCs w:val="20"/>
+              </w:rPr>
+              <w:t xml:space="preserve">V2</w:t>
+            </w:r>
+          </w:p>
+        </w:tc>
+        <w:tc>
+          <w:tcPr>
+            <w:tcW w:type="dxa" w:w="2268"/>
+            <w:tcBorders>
+              <w:top w:val="single" w:color="CCCCCC" w:sz="1"/>
+              <w:left w:val="single" w:color="CCCCCC" w:sz="1"/>
+              <w:bottom w:val="single" w:color="CCCCCC" w:sz="1"/>
+              <w:right w:val="single" w:color="CCCCCC" w:sz="1"/>
+            </w:tcBorders>
+            <w:tcMar>
+              <w:top w:type="dxa" w:w="60"/>
+              <w:left w:type="dxa" w:w="100"/>
+              <w:bottom w:type="dxa" w:w="60"/>
+              <w:right w:type="dxa" w:w="100"/>
+            </w:tcMar>
+          </w:tcPr>
+          <w:p>
+            <w:pPr>
+              <w:spacing w:line="288"/>
+            </w:pPr>
+            <w:r>
+              <w:rPr>
+                <w:rFonts w:ascii="SimSun" w:cs="SimSun" w:eastAsia="SimSun" w:hAnsi="SimSun"/>
+                <w:color w:val="333333"/>
+                <w:sz w:val="20"/>
+                <w:szCs w:val="20"/>
+              </w:rPr>
+              <w:t xml:space="preserve">HTTP 轮询 + ngrok 隧道</w:t>
+            </w:r>
+          </w:p>
+        </w:tc>
+        <w:tc>
+          <w:tcPr>
+            <w:tcW w:type="dxa" w:w="2268"/>
+            <w:tcBorders>
+              <w:top w:val="single" w:color="CCCCCC" w:sz="1"/>
+              <w:left w:val="single" w:color="CCCCCC" w:sz="1"/>
+              <w:bottom w:val="single" w:color="CCCCCC" w:sz="1"/>
+              <w:right w:val="single" w:color="CCCCCC" w:sz="1"/>
+            </w:tcBorders>
+            <w:tcMar>
+              <w:top w:type="dxa" w:w="60"/>
+              <w:left w:type="dxa" w:w="100"/>
+              <w:bottom w:type="dxa" w:w="60"/>
+              <w:right w:type="dxa" w:w="100"/>
+            </w:tcMar>
+          </w:tcPr>
+          <w:p>
+            <w:pPr>
+              <w:spacing w:line="288"/>
+            </w:pPr>
+            <w:r>
+              <w:rPr>
+                <w:rFonts w:ascii="SimSun" w:cs="SimSun" w:eastAsia="SimSun" w:hAnsi="SimSun"/>
+                <w:color w:val="333333"/>
+                <w:sz w:val="20"/>
+                <w:szCs w:val="20"/>
+              </w:rPr>
+              <w:t xml:space="preserve">❌</w:t>
+            </w:r>
+          </w:p>
+        </w:tc>
+        <w:tc>
+          <w:tcPr>
+            <w:tcW w:type="dxa" w:w="2268"/>
+            <w:tcBorders>
+              <w:top w:val="single" w:color="CCCCCC" w:sz="1"/>
+              <w:left w:val="single" w:color="CCCCCC" w:sz="1"/>
+              <w:bottom w:val="single" w:color="CCCCCC" w:sz="1"/>
+              <w:right w:val="single" w:color="CCCCCC" w:sz="1"/>
+            </w:tcBorders>
+            <w:tcMar>
+              <w:top w:type="dxa" w:w="60"/>
+              <w:left w:type="dxa" w:w="100"/>
+              <w:bottom w:type="dxa" w:w="60"/>
+              <w:right w:type="dxa" w:w="100"/>
+            </w:tcMar>
+          </w:tcPr>
+          <w:p>
+            <w:pPr>
+              <w:spacing w:line="288"/>
+            </w:pPr>
+            <w:r>
+              <w:rPr>
+                <w:rFonts w:ascii="SimSun" w:cs="SimSun" w:eastAsia="SimSun" w:hAnsi="SimSun"/>
+                <w:color w:val="333333"/>
+                <w:sz w:val="20"/>
+                <w:szCs w:val="20"/>
+              </w:rPr>
+              <w:t xml:space="preserve">DNS 污染 + 免费版限流</w:t>
+            </w:r>
+          </w:p>
+        </w:tc>
+      </w:tr>
+      <w:tr>
+        <w:tc>
+          <w:tcPr>
+            <w:tcW w:type="dxa" w:w="2268"/>
+            <w:tcBorders>
+              <w:top w:val="single" w:color="CCCCCC" w:sz="1"/>
+              <w:left w:val="single" w:color="CCCCCC" w:sz="1"/>
+              <w:bottom w:val="single" w:color="CCCCCC" w:sz="1"/>
+              <w:right w:val="single" w:color="CCCCCC" w:sz="1"/>
+            </w:tcBorders>
+            <w:tcMar>
+              <w:top w:type="dxa" w:w="60"/>
+              <w:left w:type="dxa" w:w="100"/>
+              <w:bottom w:type="dxa" w:w="60"/>
+              <w:right w:type="dxa" w:w="100"/>
+            </w:tcMar>
+          </w:tcPr>
+          <w:p>
+            <w:pPr>
+              <w:spacing w:line="288"/>
+            </w:pPr>
+            <w:r>
+              <w:rPr>
+                <w:rFonts w:ascii="SimSun" w:cs="SimSun" w:eastAsia="SimSun" w:hAnsi="SimSun"/>
+                <w:color w:val="333333"/>
+                <w:sz w:val="20"/>
+                <w:szCs w:val="20"/>
+              </w:rPr>
+              <w:t xml:space="preserve">V3</w:t>
+            </w:r>
+          </w:p>
+        </w:tc>
+        <w:tc>
+          <w:tcPr>
+            <w:tcW w:type="dxa" w:w="2268"/>
+            <w:tcBorders>
+              <w:top w:val="single" w:color="CCCCCC" w:sz="1"/>
+              <w:left w:val="single" w:color="CCCCCC" w:sz="1"/>
+              <w:bottom w:val="single" w:color="CCCCCC" w:sz="1"/>
+              <w:right w:val="single" w:color="CCCCCC" w:sz="1"/>
+            </w:tcBorders>
+            <w:tcMar>
+              <w:top w:type="dxa" w:w="60"/>
+              <w:left w:type="dxa" w:w="100"/>
+              <w:bottom w:type="dxa" w:w="60"/>
+              <w:right w:type="dxa" w:w="100"/>
+            </w:tcMar>
+          </w:tcPr>
+          <w:p>
+            <w:pPr>
+              <w:spacing w:line="288"/>
+            </w:pPr>
+            <w:r>
+              <w:rPr>
+                <w:rFonts w:ascii="SimSun" w:cs="SimSun" w:eastAsia="SimSun" w:hAnsi="SimSun"/>
+                <w:color w:val="333333"/>
+                <w:sz w:val="20"/>
+                <w:szCs w:val="20"/>
+              </w:rPr>
+              <w:t xml:space="preserve">Railway 桥接 (bridge.cjs)</w:t>
+            </w:r>
+          </w:p>
+        </w:tc>
+        <w:tc>
+          <w:tcPr>
+            <w:tcW w:type="dxa" w:w="2268"/>
+            <w:tcBorders>
+              <w:top w:val="single" w:color="CCCCCC" w:sz="1"/>
+              <w:left w:val="single" w:color="CCCCCC" w:sz="1"/>
+              <w:bottom w:val="single" w:color="CCCCCC" w:sz="1"/>
+              <w:right w:val="single" w:color="CCCCCC" w:sz="1"/>
+            </w:tcBorders>
+            <w:tcMar>
+              <w:top w:type="dxa" w:w="60"/>
+              <w:left w:type="dxa" w:w="100"/>
+              <w:bottom w:type="dxa" w:w="60"/>
+              <w:right w:type="dxa" w:w="100"/>
+            </w:tcMar>
+          </w:tcPr>
+          <w:p>
+            <w:pPr>
+              <w:spacing w:line="288"/>
+            </w:pPr>
+            <w:r>
+              <w:rPr>
+                <w:rFonts w:ascii="SimSun" w:cs="SimSun" w:eastAsia="SimSun" w:hAnsi="SimSun"/>
+                <w:color w:val="333333"/>
+                <w:sz w:val="20"/>
+                <w:szCs w:val="20"/>
+              </w:rPr>
+              <w:t xml:space="preserve">✅→废弃</w:t>
+            </w:r>
+          </w:p>
+        </w:tc>
+        <w:tc>
+          <w:tcPr>
+            <w:tcW w:type="dxa" w:w="2268"/>
+            <w:tcBorders>
+              <w:top w:val="single" w:color="CCCCCC" w:sz="1"/>
+              <w:left w:val="single" w:color="CCCCCC" w:sz="1"/>
+              <w:bottom w:val="single" w:color="CCCCCC" w:sz="1"/>
+              <w:right w:val="single" w:color="CCCCCC" w:sz="1"/>
+            </w:tcBorders>
+            <w:tcMar>
+              <w:top w:type="dxa" w:w="60"/>
+              <w:left w:type="dxa" w:w="100"/>
+              <w:bottom w:type="dxa" w:w="60"/>
+              <w:right w:type="dxa" w:w="100"/>
+            </w:tcMar>
+          </w:tcPr>
+          <w:p>
+            <w:pPr>
+              <w:spacing w:line="288"/>
+            </w:pPr>
+            <w:r>
+              <w:rPr>
+                <w:rFonts w:ascii="SimSun" w:cs="SimSun" w:eastAsia="SimSun" w:hAnsi="SimSun"/>
+                <w:color w:val="333333"/>
+                <w:sz w:val="20"/>
+                <w:szCs w:val="20"/>
+              </w:rPr>
+              <w:t xml:space="preserve">多一层中转, 免费额度有限</w:t>
+            </w:r>
+          </w:p>
+        </w:tc>
+      </w:tr>
+      <w:tr>
+        <w:tc>
+          <w:tcPr>
+            <w:tcW w:type="dxa" w:w="2268"/>
+            <w:tcBorders>
+              <w:top w:val="single" w:color="CCCCCC" w:sz="1"/>
+              <w:left w:val="single" w:color="CCCCCC" w:sz="1"/>
+              <w:bottom w:val="single" w:color="CCCCCC" w:sz="1"/>
+              <w:right w:val="single" w:color="CCCCCC" w:sz="1"/>
+            </w:tcBorders>
+            <w:tcMar>
+              <w:top w:type="dxa" w:w="60"/>
+              <w:left w:type="dxa" w:w="100"/>
+              <w:bottom w:type="dxa" w:w="60"/>
+              <w:right w:type="dxa" w:w="100"/>
+            </w:tcMar>
+          </w:tcPr>
+          <w:p>
+            <w:pPr>
+              <w:spacing w:line="288"/>
+            </w:pPr>
+            <w:r>
+              <w:rPr>
+                <w:rFonts w:ascii="SimSun" w:cs="SimSun" w:eastAsia="SimSun" w:hAnsi="SimSun"/>
+                <w:color w:val="333333"/>
+                <w:sz w:val="20"/>
+                <w:szCs w:val="20"/>
+              </w:rPr>
+              <w:t xml:space="preserve">**V4**</w:t>
+            </w:r>
+          </w:p>
+        </w:tc>
+        <w:tc>
+          <w:tcPr>
+            <w:tcW w:type="dxa" w:w="2268"/>
+            <w:tcBorders>
+              <w:top w:val="single" w:color="CCCCCC" w:sz="1"/>
+              <w:left w:val="single" w:color="CCCCCC" w:sz="1"/>
+              <w:bottom w:val="single" w:color="CCCCCC" w:sz="1"/>
+              <w:right w:val="single" w:color="CCCCCC" w:sz="1"/>
+            </w:tcBorders>
+            <w:tcMar>
+              <w:top w:type="dxa" w:w="60"/>
+              <w:left w:type="dxa" w:w="100"/>
+              <w:bottom w:type="dxa" w:w="60"/>
+              <w:right w:type="dxa" w:w="100"/>
+            </w:tcMar>
+          </w:tcPr>
+          <w:p>
+            <w:pPr>
+              <w:spacing w:line="288"/>
+            </w:pPr>
+            <w:r>
+              <w:rPr>
+                <w:rFonts w:ascii="SimSun" w:cs="SimSun" w:eastAsia="SimSun" w:hAnsi="SimSun"/>
+                <w:color w:val="333333"/>
+                <w:sz w:val="20"/>
+                <w:szCs w:val="20"/>
+              </w:rPr>
+              <w:t xml:space="preserve">**OneNET API 直连**</w:t>
+            </w:r>
+          </w:p>
+        </w:tc>
+        <w:tc>
+          <w:tcPr>
+            <w:tcW w:type="dxa" w:w="2268"/>
+            <w:tcBorders>
+              <w:top w:val="single" w:color="CCCCCC" w:sz="1"/>
+              <w:left w:val="single" w:color="CCCCCC" w:sz="1"/>
+              <w:bottom w:val="single" w:color="CCCCCC" w:sz="1"/>
+              <w:right w:val="single" w:color="CCCCCC" w:sz="1"/>
+            </w:tcBorders>
+            <w:tcMar>
+              <w:top w:type="dxa" w:w="60"/>
+              <w:left w:type="dxa" w:w="100"/>
+              <w:bottom w:type="dxa" w:w="60"/>
+              <w:right w:type="dxa" w:w="100"/>
+            </w:tcMar>
+          </w:tcPr>
+          <w:p>
+            <w:pPr>
+              <w:spacing w:line="288"/>
+            </w:pPr>
+            <w:r>
+              <w:rPr>
+                <w:rFonts w:ascii="SimSun" w:cs="SimSun" w:eastAsia="SimSun" w:hAnsi="SimSun"/>
+                <w:color w:val="333333"/>
+                <w:sz w:val="20"/>
+                <w:szCs w:val="20"/>
+              </w:rPr>
+              <w:t xml:space="preserve">**✅ 当前**</w:t>
+            </w:r>
+          </w:p>
+        </w:tc>
+        <w:tc>
+          <w:tcPr>
+            <w:tcW w:type="dxa" w:w="2268"/>
+            <w:tcBorders>
+              <w:top w:val="single" w:color="CCCCCC" w:sz="1"/>
+              <w:left w:val="single" w:color="CCCCCC" w:sz="1"/>
+              <w:bottom w:val="single" w:color="CCCCCC" w:sz="1"/>
+              <w:right w:val="single" w:color="CCCCCC" w:sz="1"/>
+            </w:tcBorders>
+            <w:tcMar>
+              <w:top w:type="dxa" w:w="60"/>
+              <w:left w:type="dxa" w:w="100"/>
+              <w:bottom w:type="dxa" w:w="60"/>
+              <w:right w:type="dxa" w:w="100"/>
+            </w:tcMar>
+          </w:tcPr>
+          <w:p>
+            <w:pPr>
+              <w:spacing w:line="288"/>
+            </w:pPr>
+            <w:r>
+              <w:rPr>
+                <w:rFonts w:ascii="SimSun" w:cs="SimSun" w:eastAsia="SimSun" w:hAnsi="SimSun"/>
+                <w:color w:val="333333"/>
+                <w:sz w:val="20"/>
+                <w:szCs w:val="20"/>
+              </w:rPr>
+              <w:t xml:space="preserve">与网页端统一, 零额外依赖</w:t>
+            </w:r>
+          </w:p>
+        </w:tc>
+      </w:tr>
+    </w:tbl>
+    <w:p/>
+    <w:p/>
+    <w:p>
+      <w:pPr>
+        <w:pStyle w:val="Heading3"/>
+        <w:spacing w:after="80" w:before="160"/>
+      </w:pPr>
+      <w:r>
+        <w:rPr>
+          <w:rFonts w:ascii="Microsoft YaHei" w:cs="Microsoft YaHei" w:eastAsia="Microsoft YaHei" w:hAnsi="Microsoft YaHei"/>
           <w:b/>
           <w:bCs/>
-          <w:color w:val="333333"/>
-          <w:sz w:val="22"/>
-          <w:szCs w:val="22"/>
-        </w:rPr>
-        <w:t xml:space="preserve">网页控制台</w:t>
-      </w:r>
-      <w:r>
-        <w:rPr>
-          <w:rFonts w:ascii="SimSun" w:cs="SimSun" w:eastAsia="SimSun" w:hAnsi="SimSun"/>
-          <w:color w:val="333333"/>
-          <w:sz w:val="22"/>
-          <w:szCs w:val="22"/>
-        </w:rPr>
-        <w:t xml:space="preserve">（Cloudflare Pages, 稳定且免费）。</w:t>
+          <w:color w:val="2B579A"/>
+          <w:sz w:val="28"/>
+          <w:szCs w:val="28"/>
+        </w:rPr>
+        <w:t xml:space="preserve">7.5 Railway 桥接方案 (备选, 仅作参考)</w:t>
+      </w:r>
+    </w:p>
+    <w:p/>
+    <w:p>
+      <w:pPr>
+        <w:spacing w:line="360"/>
+      </w:pPr>
+      <w:r>
+        <w:rPr>
+          <w:rFonts w:ascii="SimSun" w:cs="SimSun" w:eastAsia="SimSun" w:hAnsi="SimSun"/>
+          <w:color w:val="333333"/>
+          <w:sz w:val="22"/>
+          <w:szCs w:val="22"/>
+        </w:rPr>
+        <w:t xml:space="preserve">如果未来 OneNET API 有变化导致小程序无法直连，可以回退到 Railway 桥接方案：</w:t>
+      </w:r>
+    </w:p>
+    <w:p/>
+    <w:p>
+      <w:pPr>
+        <w:shd w:fill="F5F5F5" w:val="clear"/>
+        <w:spacing w:line="240"/>
+        <w:ind w:left="360"/>
+      </w:pPr>
+      <w:r>
+        <w:rPr>
+          <w:rFonts w:ascii="Consolas" w:cs="Consolas" w:eastAsia="Consolas" w:hAnsi="Consolas"/>
+          <w:color w:val="2D2D2D"/>
+          <w:sz w:val="19"/>
+          <w:szCs w:val="19"/>
+        </w:rPr>
+        <w:t xml:space="preserve">小程序 ──HTTPS── Railway ──MQTT── EMQX ── ESP8266 ── STM32</w:t>
+      </w:r>
+    </w:p>
+    <w:p/>
+    <w:p>
+      <w:pPr>
+        <w:spacing w:line="360"/>
+      </w:pPr>
+      <w:r>
+        <w:rPr>
+          <w:rFonts w:ascii="SimSun" w:cs="SimSun" w:eastAsia="SimSun" w:hAnsi="SimSun"/>
+          <w:color w:val="333333"/>
+          <w:sz w:val="22"/>
+          <w:szCs w:val="22"/>
+        </w:rPr>
+        <w:t xml:space="preserve">桥接代码位于 `安卓app/server/bridge.cjs`（本地）和 `Railway_Deploy/bridge.mjs`（云端），部署参考仓库 `Ran-sh/WPT_Railway`。当前版本已不推荐此方案。</w:t>
       </w:r>
     </w:p>
     <w:p/>

</xml_diff>

<commit_message>
docs: add local dev method to web console chapter
</commit_message>
<xml_diff>
--- a/Claude_Files/docs/WPT无线充电系统-从零搭建全指南.docx
+++ b/Claude_Files/docs/WPT无线充电系统-从零搭建全指南.docx
@@ -14196,7 +14196,168 @@
           <w:sz w:val="28"/>
           <w:szCs w:val="28"/>
         </w:rPr>
-        <w:t xml:space="preserve">6.1 方案演进 (我们踩过的全记录)</w:t>
+        <w:t xml:space="preserve">6.1 本地开发 (V1, 调试保留)</w:t>
+      </w:r>
+    </w:p>
+    <w:p/>
+    <w:p>
+      <w:pPr>
+        <w:spacing w:line="360"/>
+      </w:pPr>
+      <w:r>
+        <w:rPr>
+          <w:rFonts w:ascii="SimSun" w:cs="SimSun" w:eastAsia="SimSun" w:hAnsi="SimSun"/>
+          <w:color w:val="333333"/>
+          <w:sz w:val="22"/>
+          <w:szCs w:val="22"/>
+        </w:rPr>
+        <w:t xml:space="preserve">在电脑上直接运行，浏览器 `http://localhost:4567` 打开：</w:t>
+      </w:r>
+    </w:p>
+    <w:p/>
+    <w:p>
+      <w:pPr>
+        <w:shd w:fill="F5F5F5" w:val="clear"/>
+        <w:spacing w:line="240"/>
+        <w:ind w:left="360"/>
+      </w:pPr>
+      <w:r>
+        <w:rPr>
+          <w:rFonts w:ascii="Consolas" w:cs="Consolas" w:eastAsia="Consolas" w:hAnsi="Consolas"/>
+          <w:color w:val="2D2D2D"/>
+          <w:sz w:val="19"/>
+          <w:szCs w:val="19"/>
+        </w:rPr>
+        <w:t xml:space="preserve">cd ONENETapp</w:t>
+      </w:r>
+    </w:p>
+    <w:p>
+      <w:pPr>
+        <w:shd w:fill="F5F5F5" w:val="clear"/>
+        <w:spacing w:line="240"/>
+        <w:ind w:left="360"/>
+      </w:pPr>
+      <w:r>
+        <w:rPr>
+          <w:rFonts w:ascii="Consolas" w:cs="Consolas" w:eastAsia="Consolas" w:hAnsi="Consolas"/>
+          <w:color w:val="2D2D2D"/>
+          <w:sz w:val="19"/>
+          <w:szCs w:val="19"/>
+        </w:rPr>
+        <w:t xml:space="preserve">node -e "const h=require('http');const f=require('fs');const p=require('path');</w:t>
+      </w:r>
+    </w:p>
+    <w:p>
+      <w:pPr>
+        <w:shd w:fill="F5F5F5" w:val="clear"/>
+        <w:spacing w:line="240"/>
+        <w:ind w:left="360"/>
+      </w:pPr>
+      <w:r>
+        <w:rPr>
+          <w:rFonts w:ascii="Consolas" w:cs="Consolas" w:eastAsia="Consolas" w:hAnsi="Consolas"/>
+          <w:color w:val="2D2D2D"/>
+          <w:sz w:val="19"/>
+          <w:szCs w:val="19"/>
+        </w:rPr>
+        <w:t xml:space="preserve">h.createServer((q,r)=&gt;{let fp=q.url.split('?')[0];if(fp==='/')fp='/login.html';</w:t>
+      </w:r>
+    </w:p>
+    <w:p>
+      <w:pPr>
+        <w:shd w:fill="F5F5F5" w:val="clear"/>
+        <w:spacing w:line="240"/>
+        <w:ind w:left="360"/>
+      </w:pPr>
+      <w:r>
+        <w:rPr>
+          <w:rFonts w:ascii="Consolas" w:cs="Consolas" w:eastAsia="Consolas" w:hAnsi="Consolas"/>
+          <w:color w:val="2D2D2D"/>
+          <w:sz w:val="19"/>
+          <w:szCs w:val="19"/>
+        </w:rPr>
+        <w:t xml:space="preserve">if(!p.extname(fp))fp+='.html';</w:t>
+      </w:r>
+    </w:p>
+    <w:p>
+      <w:pPr>
+        <w:shd w:fill="F5F5F5" w:val="clear"/>
+        <w:spacing w:line="240"/>
+        <w:ind w:left="360"/>
+      </w:pPr>
+      <w:r>
+        <w:rPr>
+          <w:rFonts w:ascii="Consolas" w:cs="Consolas" w:eastAsia="Consolas" w:hAnsi="Consolas"/>
+          <w:color w:val="2D2D2D"/>
+          <w:sz w:val="19"/>
+          <w:szCs w:val="19"/>
+        </w:rPr>
+        <w:t xml:space="preserve">f.readFile(p.join(__dirname,fp),(e,d)=&gt;{if(e){f.readFile(p.join(__dirname,</w:t>
+      </w:r>
+    </w:p>
+    <w:p>
+      <w:pPr>
+        <w:shd w:fill="F5F5F5" w:val="clear"/>
+        <w:spacing w:line="240"/>
+        <w:ind w:left="360"/>
+      </w:pPr>
+      <w:r>
+        <w:rPr>
+          <w:rFonts w:ascii="Consolas" w:cs="Consolas" w:eastAsia="Consolas" w:hAnsi="Consolas"/>
+          <w:color w:val="2D2D2D"/>
+          <w:sz w:val="19"/>
+          <w:szCs w:val="19"/>
+        </w:rPr>
+        <w:t xml:space="preserve">'login.html'),(e2,d2)=&gt;{r.writeHead(200);r.end(d2)});return}</w:t>
+      </w:r>
+    </w:p>
+    <w:p>
+      <w:pPr>
+        <w:shd w:fill="F5F5F5" w:val="clear"/>
+        <w:spacing w:line="240"/>
+        <w:ind w:left="360"/>
+      </w:pPr>
+      <w:r>
+        <w:rPr>
+          <w:rFonts w:ascii="Consolas" w:cs="Consolas" w:eastAsia="Consolas" w:hAnsi="Consolas"/>
+          <w:color w:val="2D2D2D"/>
+          <w:sz w:val="19"/>
+          <w:szCs w:val="19"/>
+        </w:rPr>
+        <w:t xml:space="preserve">r.writeHead(200);r.end(d)})}).listen(4567,()=&gt;console.log('http://localhost:4567'))"</w:t>
+      </w:r>
+    </w:p>
+    <w:p/>
+    <w:p>
+      <w:pPr>
+        <w:spacing w:line="360"/>
+      </w:pPr>
+      <w:r>
+        <w:rPr>
+          <w:rFonts w:ascii="SimSun" w:cs="SimSun" w:eastAsia="SimSun" w:hAnsi="SimSun"/>
+          <w:color w:val="333333"/>
+          <w:sz w:val="22"/>
+          <w:szCs w:val="22"/>
+        </w:rPr>
+        <w:t xml:space="preserve">本地模式适合调试——改了代码立刻刷新看效果。缺点是无法外网访问，手机和其他设备打不开。</w:t>
+      </w:r>
+    </w:p>
+    <w:p/>
+    <w:p>
+      <w:pPr>
+        <w:pStyle w:val="Heading3"/>
+        <w:spacing w:after="80" w:before="160"/>
+      </w:pPr>
+      <w:r>
+        <w:rPr>
+          <w:rFonts w:ascii="Microsoft YaHei" w:cs="Microsoft YaHei" w:eastAsia="Microsoft YaHei" w:hAnsi="Microsoft YaHei"/>
+          <w:b/>
+          <w:bCs/>
+          <w:color w:val="2B579A"/>
+          <w:sz w:val="28"/>
+          <w:szCs w:val="28"/>
+        </w:rPr>
+        <w:t xml:space="preserve">6.2 方案演进 (我们踩过的全记录)</w:t>
       </w:r>
     </w:p>
     <w:p/>
@@ -14372,7 +14533,7 @@
                 <w:sz w:val="20"/>
                 <w:szCs w:val="20"/>
               </w:rPr>
-              <w:t xml:space="preserve">本地 `node -e "..."` 启动</w:t>
+              <w:t xml:space="preserve">**本地 Node.js 服务**</w:t>
             </w:r>
           </w:p>
         </w:tc>
@@ -14403,7 +14564,7 @@
                 <w:sz w:val="20"/>
                 <w:szCs w:val="20"/>
               </w:rPr>
-              <w:t xml:space="preserve">只能自己电脑用</w:t>
+              <w:t xml:space="preserve">只能自己电脑用, 无法外网访问</w:t>
             </w:r>
           </w:p>
         </w:tc>
@@ -14498,7 +14659,7 @@
                 <w:sz w:val="20"/>
                 <w:szCs w:val="20"/>
               </w:rPr>
-              <w:t xml:space="preserve">免费带宽耗尽, 网站被暂停 ☠️</w:t>
+              <w:t xml:space="preserve">刚上线时正常, 后来免费带宽耗尽被暂停 ☠️</w:t>
             </w:r>
           </w:p>
         </w:tc>
@@ -14593,7 +14754,7 @@
                 <w:sz w:val="20"/>
                 <w:szCs w:val="20"/>
               </w:rPr>
-              <w:t xml:space="preserve">子目录路由 `/monitoring` 不认 `.html` → 404</w:t>
+              <w:t xml:space="preserve">部署成功但路由有 bug——`/monitoring` 无法映射到 `monitoring.html` → 404</w:t>
             </w:r>
           </w:p>
         </w:tc>
@@ -14626,7 +14787,7 @@
                 <w:sz w:val="20"/>
                 <w:szCs w:val="20"/>
               </w:rPr>
-              <w:t xml:space="preserve">V4</w:t>
+              <w:t xml:space="preserve">**V4**</w:t>
             </w:r>
           </w:p>
         </w:tc>
@@ -14688,7 +14849,7 @@
                 <w:sz w:val="20"/>
                 <w:szCs w:val="20"/>
               </w:rPr>
-              <w:t xml:space="preserve">免费不限量, 支持SPA路由, 当前方案</w:t>
+              <w:t xml:space="preserve">免费不限量, 原生支持 SPA 路由, **当前方案**</w:t>
             </w:r>
           </w:p>
         </w:tc>

</xml_diff>

<commit_message>
docs: update CLAUDE.md V6.1 — overcurrent protection, V6.1 fix table, PRIMASK compliance notes
- Add overcurrent protection section (5A threshold in Ui_Controller_Task)
- Add V6.1 key fixes table (8 bugs across CRITICAL/HIGH/MEDIUM/LOW)
- Update startup flow with DBGMCU IWDG debug freeze
- Update full guide doc version V5.1→V6.1 with change log entry
- Regenerate .docx paired file
</commit_message>
<xml_diff>
--- a/Claude_Files/docs/WPT无线充电系统-从零搭建全指南.docx
+++ b/Claude_Files/docs/WPT无线充电系统-从零搭建全指南.docx
@@ -288,7 +288,7 @@
                 <w:sz w:val="20"/>
                 <w:szCs w:val="20"/>
               </w:rPr>
-              <w:t xml:space="preserve">V5.1</w:t>
+              <w:t xml:space="preserve">V6.1</w:t>
             </w:r>
           </w:p>
         </w:tc>
@@ -352,7 +352,7 @@
                 <w:sz w:val="20"/>
                 <w:szCs w:val="20"/>
               </w:rPr>
-              <w:t xml:space="preserve">2026-05-25</w:t>
+              <w:t xml:space="preserve">2026-06-01</w:t>
             </w:r>
           </w:p>
         </w:tc>
@@ -416,7 +416,7 @@
                 <w:sz w:val="20"/>
                 <w:szCs w:val="20"/>
               </w:rPr>
-              <w:t xml:space="preserve">V5.1</w:t>
+              <w:t xml:space="preserve">V6.1</w:t>
             </w:r>
           </w:p>
         </w:tc>
@@ -902,6 +902,163 @@
                 <w:szCs w:val="20"/>
               </w:rPr>
               <w:t xml:space="preserve">全篇重构：新增调试避坑模块、配图标注、双主题小程序、频率渐变斜坡、网页端Cloudflare部署、1.6万字扩写</w:t>
+            </w:r>
+          </w:p>
+        </w:tc>
+      </w:tr>
+      <w:tr>
+        <w:tc>
+          <w:tcPr>
+            <w:tcW w:type="dxa" w:w="3024"/>
+            <w:tcBorders>
+              <w:top w:val="single" w:color="CCCCCC" w:sz="1"/>
+              <w:left w:val="single" w:color="CCCCCC" w:sz="1"/>
+              <w:bottom w:val="single" w:color="CCCCCC" w:sz="1"/>
+              <w:right w:val="single" w:color="CCCCCC" w:sz="1"/>
+            </w:tcBorders>
+            <w:tcMar>
+              <w:top w:type="dxa" w:w="60"/>
+              <w:left w:type="dxa" w:w="100"/>
+              <w:bottom w:type="dxa" w:w="60"/>
+              <w:right w:type="dxa" w:w="100"/>
+            </w:tcMar>
+          </w:tcPr>
+          <w:p>
+            <w:pPr>
+              <w:spacing w:line="288"/>
+            </w:pPr>
+            <w:r>
+              <w:rPr>
+                <w:rFonts w:ascii="SimSun" w:cs="SimSun" w:eastAsia="SimSun" w:hAnsi="SimSun"/>
+                <w:color w:val="333333"/>
+                <w:sz w:val="20"/>
+                <w:szCs w:val="20"/>
+              </w:rPr>
+              <w:t xml:space="preserve">V6.1</w:t>
+            </w:r>
+          </w:p>
+        </w:tc>
+        <w:tc>
+          <w:tcPr>
+            <w:tcW w:type="dxa" w:w="3024"/>
+            <w:tcBorders>
+              <w:top w:val="single" w:color="CCCCCC" w:sz="1"/>
+              <w:left w:val="single" w:color="CCCCCC" w:sz="1"/>
+              <w:bottom w:val="single" w:color="CCCCCC" w:sz="1"/>
+              <w:right w:val="single" w:color="CCCCCC" w:sz="1"/>
+            </w:tcBorders>
+            <w:tcMar>
+              <w:top w:type="dxa" w:w="60"/>
+              <w:left w:type="dxa" w:w="100"/>
+              <w:bottom w:type="dxa" w:w="60"/>
+              <w:right w:type="dxa" w:w="100"/>
+            </w:tcMar>
+          </w:tcPr>
+          <w:p>
+            <w:pPr>
+              <w:spacing w:line="288"/>
+            </w:pPr>
+            <w:r>
+              <w:rPr>
+                <w:rFonts w:ascii="SimSun" w:cs="SimSun" w:eastAsia="SimSun" w:hAnsi="SimSun"/>
+                <w:color w:val="333333"/>
+                <w:sz w:val="20"/>
+                <w:szCs w:val="20"/>
+              </w:rPr>
+              <w:t xml:space="preserve">2026-06-01</w:t>
+            </w:r>
+          </w:p>
+        </w:tc>
+        <w:tc>
+          <w:tcPr>
+            <w:tcW w:type="dxa" w:w="3024"/>
+            <w:tcBorders>
+              <w:top w:val="single" w:color="CCCCCC" w:sz="1"/>
+              <w:left w:val="single" w:color="CCCCCC" w:sz="1"/>
+              <w:bottom w:val="single" w:color="CCCCCC" w:sz="1"/>
+              <w:right w:val="single" w:color="CCCCCC" w:sz="1"/>
+            </w:tcBorders>
+            <w:tcMar>
+              <w:top w:type="dxa" w:w="60"/>
+              <w:left w:type="dxa" w:w="100"/>
+              <w:bottom w:type="dxa" w:w="60"/>
+              <w:right w:type="dxa" w:w="100"/>
+            </w:tcMar>
+          </w:tcPr>
+          <w:p>
+            <w:pPr>
+              <w:spacing w:line="288"/>
+            </w:pPr>
+            <w:r>
+              <w:rPr>
+                <w:rFonts w:ascii="SimSun" w:cs="SimSun" w:eastAsia="SimSun" w:hAnsi="SimSun"/>
+                <w:color w:val="333333"/>
+                <w:sz w:val="20"/>
+                <w:szCs w:val="20"/>
+              </w:rPr>
+              <w:t xml:space="preserve">8项Bug修复: CRITICAL-PWM基线恢复V0.0(Up计数+PartialRemap+PWM1/PWM2), 频率斜坡容差收敛(</w:t>
+            </w:r>
+          </w:p>
+        </w:tc>
+        <w:tc>
+          <w:tcPr>
+            <w:tcW w:type="dxa" w:w="3024"/>
+            <w:tcBorders>
+              <w:top w:val="single" w:color="CCCCCC" w:sz="1"/>
+              <w:left w:val="single" w:color="CCCCCC" w:sz="1"/>
+              <w:bottom w:val="single" w:color="CCCCCC" w:sz="1"/>
+              <w:right w:val="single" w:color="CCCCCC" w:sz="1"/>
+            </w:tcBorders>
+            <w:tcMar>
+              <w:top w:type="dxa" w:w="60"/>
+              <w:left w:type="dxa" w:w="100"/>
+              <w:bottom w:type="dxa" w:w="60"/>
+              <w:right w:type="dxa" w:w="100"/>
+            </w:tcMar>
+          </w:tcPr>
+          <w:p>
+            <w:pPr>
+              <w:spacing w:line="288"/>
+            </w:pPr>
+            <w:r>
+              <w:rPr>
+                <w:rFonts w:ascii="SimSun" w:cs="SimSun" w:eastAsia="SimSun" w:hAnsi="SimSun"/>
+                <w:color w:val="333333"/>
+                <w:sz w:val="20"/>
+                <w:szCs w:val="20"/>
+              </w:rPr>
+              <w:t xml:space="preserve">diff</w:t>
+            </w:r>
+          </w:p>
+        </w:tc>
+        <w:tc>
+          <w:tcPr>
+            <w:tcW w:type="dxa" w:w="3024"/>
+            <w:tcBorders>
+              <w:top w:val="single" w:color="CCCCCC" w:sz="1"/>
+              <w:left w:val="single" w:color="CCCCCC" w:sz="1"/>
+              <w:bottom w:val="single" w:color="CCCCCC" w:sz="1"/>
+              <w:right w:val="single" w:color="CCCCCC" w:sz="1"/>
+            </w:tcBorders>
+            <w:tcMar>
+              <w:top w:type="dxa" w:w="60"/>
+              <w:left w:type="dxa" w:w="100"/>
+              <w:bottom w:type="dxa" w:w="60"/>
+              <w:right w:type="dxa" w:w="100"/>
+            </w:tcMar>
+          </w:tcPr>
+          <w:p>
+            <w:pPr>
+              <w:spacing w:line="288"/>
+            </w:pPr>
+            <w:r>
+              <w:rPr>
+                <w:rFonts w:ascii="SimSun" w:cs="SimSun" w:eastAsia="SimSun" w:hAnsi="SimSun"/>
+                <w:color w:val="333333"/>
+                <w:sz w:val="20"/>
+                <w:szCs w:val="20"/>
+              </w:rPr>
+              <w:t xml:space="preserve">≤1000Hz), 过流保护5A接入(Soft_Start_Fault调用); HIGH-RX缓冲清除+PRIMASK规范; MEDIUM-Adc静态断言HSE72MHz, double→float, EMA状态重置; LOW-遥测门控重构</w:t>
             </w:r>
           </w:p>
         </w:tc>

</xml_diff>

<commit_message>
chore: simplify 12 code quality fixes + update docs to V6.2
</commit_message>
<xml_diff>
--- a/Claude_Files/docs/WPT无线充电系统-从零搭建全指南.docx
+++ b/Claude_Files/docs/WPT无线充电系统-从零搭建全指南.docx
@@ -288,7 +288,7 @@
                 <w:sz w:val="20"/>
                 <w:szCs w:val="20"/>
               </w:rPr>
-              <w:t xml:space="preserve">V6.1</w:t>
+              <w:t xml:space="preserve">V6.2</w:t>
             </w:r>
           </w:p>
         </w:tc>
@@ -352,7 +352,7 @@
                 <w:sz w:val="20"/>
                 <w:szCs w:val="20"/>
               </w:rPr>
-              <w:t xml:space="preserve">2026-06-01</w:t>
+              <w:t xml:space="preserve">2026-06-04</w:t>
             </w:r>
           </w:p>
         </w:tc>
@@ -416,7 +416,7 @@
                 <w:sz w:val="20"/>
                 <w:szCs w:val="20"/>
               </w:rPr>
-              <w:t xml:space="preserve">V6.1</w:t>
+              <w:t xml:space="preserve">V6.2</w:t>
             </w:r>
           </w:p>
         </w:tc>
@@ -480,7 +480,7 @@
                 <w:sz w:val="20"/>
                 <w:szCs w:val="20"/>
               </w:rPr>
-              <w:t xml:space="preserve">[Ran-sh/WPT_PWM](https://github.com/Ran-sh/WPT_PWM) (分支 `ONENET`)</w:t>
+              <w:t xml:space="preserve">[Ran-sh/WPT_PWM](https://github.com/Ran-sh/WPT_PWM) (分支 `3.0ONENET`)</w:t>
             </w:r>
           </w:p>
         </w:tc>
@@ -807,6 +807,101 @@
                 <w:szCs w:val="20"/>
               </w:rPr>
               <w:t xml:space="preserve">变更说明</w:t>
+            </w:r>
+          </w:p>
+        </w:tc>
+      </w:tr>
+      <w:tr>
+        <w:tc>
+          <w:tcPr>
+            <w:tcW w:type="dxa" w:w="3024"/>
+            <w:tcBorders>
+              <w:top w:val="single" w:color="CCCCCC" w:sz="1"/>
+              <w:left w:val="single" w:color="CCCCCC" w:sz="1"/>
+              <w:bottom w:val="single" w:color="CCCCCC" w:sz="1"/>
+              <w:right w:val="single" w:color="CCCCCC" w:sz="1"/>
+            </w:tcBorders>
+            <w:tcMar>
+              <w:top w:type="dxa" w:w="60"/>
+              <w:left w:type="dxa" w:w="100"/>
+              <w:bottom w:type="dxa" w:w="60"/>
+              <w:right w:type="dxa" w:w="100"/>
+            </w:tcMar>
+          </w:tcPr>
+          <w:p>
+            <w:pPr>
+              <w:spacing w:line="288"/>
+            </w:pPr>
+            <w:r>
+              <w:rPr>
+                <w:rFonts w:ascii="SimSun" w:cs="SimSun" w:eastAsia="SimSun" w:hAnsi="SimSun"/>
+                <w:color w:val="333333"/>
+                <w:sz w:val="20"/>
+                <w:szCs w:val="20"/>
+              </w:rPr>
+              <w:t xml:space="preserve">V6.2</w:t>
+            </w:r>
+          </w:p>
+        </w:tc>
+        <w:tc>
+          <w:tcPr>
+            <w:tcW w:type="dxa" w:w="3024"/>
+            <w:tcBorders>
+              <w:top w:val="single" w:color="CCCCCC" w:sz="1"/>
+              <w:left w:val="single" w:color="CCCCCC" w:sz="1"/>
+              <w:bottom w:val="single" w:color="CCCCCC" w:sz="1"/>
+              <w:right w:val="single" w:color="CCCCCC" w:sz="1"/>
+            </w:tcBorders>
+            <w:tcMar>
+              <w:top w:type="dxa" w:w="60"/>
+              <w:left w:type="dxa" w:w="100"/>
+              <w:bottom w:type="dxa" w:w="60"/>
+              <w:right w:type="dxa" w:w="100"/>
+            </w:tcMar>
+          </w:tcPr>
+          <w:p>
+            <w:pPr>
+              <w:spacing w:line="288"/>
+            </w:pPr>
+            <w:r>
+              <w:rPr>
+                <w:rFonts w:ascii="SimSun" w:cs="SimSun" w:eastAsia="SimSun" w:hAnsi="SimSun"/>
+                <w:color w:val="333333"/>
+                <w:sz w:val="20"/>
+                <w:szCs w:val="20"/>
+              </w:rPr>
+              <w:t xml:space="preserve">2026-06-04</w:t>
+            </w:r>
+          </w:p>
+        </w:tc>
+        <w:tc>
+          <w:tcPr>
+            <w:tcW w:type="dxa" w:w="3024"/>
+            <w:tcBorders>
+              <w:top w:val="single" w:color="CCCCCC" w:sz="1"/>
+              <w:left w:val="single" w:color="CCCCCC" w:sz="1"/>
+              <w:bottom w:val="single" w:color="CCCCCC" w:sz="1"/>
+              <w:right w:val="single" w:color="CCCCCC" w:sz="1"/>
+            </w:tcBorders>
+            <w:tcMar>
+              <w:top w:type="dxa" w:w="60"/>
+              <w:left w:type="dxa" w:w="100"/>
+              <w:bottom w:type="dxa" w:w="60"/>
+              <w:right w:type="dxa" w:w="100"/>
+            </w:tcMar>
+          </w:tcPr>
+          <w:p>
+            <w:pPr>
+              <w:spacing w:line="288"/>
+            </w:pPr>
+            <w:r>
+              <w:rPr>
+                <w:rFonts w:ascii="SimSun" w:cs="SimSun" w:eastAsia="SimSun" w:hAnsi="SimSun"/>
+                <w:color w:val="333333"/>
+                <w:sz w:val="20"/>
+                <w:szCs w:val="20"/>
+              </w:rPr>
+              <w:t xml:space="preserve">12项代码质量优化: MEDIUM-Oled写合并重复代码+删除Oled_Int_Pow(LUT/位位移替代), EMA魔法数字→Ui_Controller_EMA(), Ui重复状态检测合并, App_Network样板代码→Reset_Connect_State()+PROTO_*常量, Esp8266删除死代码HW_DONE; LOW-Adc删除无效编译期断言+稳态预计算缩放+双读DWT合并, Ui硬编码retry→App_Network_Get_Max_Retries(); 分支3.0ONENET</w:t>
             </w:r>
           </w:p>
         </w:tc>

</xml_diff>

<commit_message>
docs: V4.2.2 — 更新全部内容 (CLAUDE.md + 开发指南 + 技能文件 + .docx)
文件结构行数更新: STM32 5063(+126)/ESP8266 522(+28)/Web 3529/小程序 1939(+94) = 11053行
审查历史追加: WiFi OFFLINE 双模式 + BOOT_WAIT加速 + MQTT超时保护 + 8项bug修复
App_Network 文档段重写: 6态枚举 + OFFLINE_PASSIVE/ACTIVE 行为 + 重试/离线自动恢复机制
ESP8266 文档段新增: 状态机对齐/CMD:WIFI_DISC/CMD:CLEAR/持续重试不放弃
</commit_message>
<xml_diff>
--- a/Claude_Files/docs/WPT无线充电系统-从零搭建全指南.docx
+++ b/Claude_Files/docs/WPT无线充电系统-从零搭建全指南.docx
@@ -288,7 +288,7 @@
                 <w:sz w:val="20"/>
                 <w:szCs w:val="20"/>
               </w:rPr>
-              <w:t xml:space="preserve">V4.2.1</w:t>
+              <w:t xml:space="preserve">V4.2.2</w:t>
             </w:r>
           </w:p>
         </w:tc>
@@ -416,7 +416,7 @@
                 <w:sz w:val="20"/>
                 <w:szCs w:val="20"/>
               </w:rPr>
-              <w:t xml:space="preserve">V4.2.1 (分支 `4.0TFT`)</w:t>
+              <w:t xml:space="preserve">V4.2.2 (分支 `4.0TFT`)</w:t>
             </w:r>
           </w:p>
         </w:tc>
@@ -902,6 +902,101 @@
                 <w:szCs w:val="20"/>
               </w:rPr>
               <w:t xml:space="preserve">全篇重构: 调试避坑模块、配图标注、双主题小程序、频率渐变斜坡、Cloudflare部署</w:t>
+            </w:r>
+          </w:p>
+        </w:tc>
+      </w:tr>
+      <w:tr>
+        <w:tc>
+          <w:tcPr>
+            <w:tcW w:type="dxa" w:w="3024"/>
+            <w:tcBorders>
+              <w:top w:val="single" w:color="CCCCCC" w:sz="1"/>
+              <w:left w:val="single" w:color="CCCCCC" w:sz="1"/>
+              <w:bottom w:val="single" w:color="CCCCCC" w:sz="1"/>
+              <w:right w:val="single" w:color="CCCCCC" w:sz="1"/>
+            </w:tcBorders>
+            <w:tcMar>
+              <w:top w:type="dxa" w:w="60"/>
+              <w:left w:type="dxa" w:w="100"/>
+              <w:bottom w:type="dxa" w:w="60"/>
+              <w:right w:type="dxa" w:w="100"/>
+            </w:tcMar>
+          </w:tcPr>
+          <w:p>
+            <w:pPr>
+              <w:spacing w:line="288"/>
+            </w:pPr>
+            <w:r>
+              <w:rPr>
+                <w:rFonts w:ascii="SimSun" w:cs="SimSun" w:eastAsia="SimSun" w:hAnsi="SimSun"/>
+                <w:color w:val="333333"/>
+                <w:sz w:val="20"/>
+                <w:szCs w:val="20"/>
+              </w:rPr>
+              <w:t xml:space="preserve">V4.2.2</w:t>
+            </w:r>
+          </w:p>
+        </w:tc>
+        <w:tc>
+          <w:tcPr>
+            <w:tcW w:type="dxa" w:w="3024"/>
+            <w:tcBorders>
+              <w:top w:val="single" w:color="CCCCCC" w:sz="1"/>
+              <w:left w:val="single" w:color="CCCCCC" w:sz="1"/>
+              <w:bottom w:val="single" w:color="CCCCCC" w:sz="1"/>
+              <w:right w:val="single" w:color="CCCCCC" w:sz="1"/>
+            </w:tcBorders>
+            <w:tcMar>
+              <w:top w:type="dxa" w:w="60"/>
+              <w:left w:type="dxa" w:w="100"/>
+              <w:bottom w:type="dxa" w:w="60"/>
+              <w:right w:type="dxa" w:w="100"/>
+            </w:tcMar>
+          </w:tcPr>
+          <w:p>
+            <w:pPr>
+              <w:spacing w:line="288"/>
+            </w:pPr>
+            <w:r>
+              <w:rPr>
+                <w:rFonts w:ascii="SimSun" w:cs="SimSun" w:eastAsia="SimSun" w:hAnsi="SimSun"/>
+                <w:color w:val="333333"/>
+                <w:sz w:val="20"/>
+                <w:szCs w:val="20"/>
+              </w:rPr>
+              <w:t xml:space="preserve">2026-06-17</w:t>
+            </w:r>
+          </w:p>
+        </w:tc>
+        <w:tc>
+          <w:tcPr>
+            <w:tcW w:type="dxa" w:w="3024"/>
+            <w:tcBorders>
+              <w:top w:val="single" w:color="CCCCCC" w:sz="1"/>
+              <w:left w:val="single" w:color="CCCCCC" w:sz="1"/>
+              <w:bottom w:val="single" w:color="CCCCCC" w:sz="1"/>
+              <w:right w:val="single" w:color="CCCCCC" w:sz="1"/>
+            </w:tcBorders>
+            <w:tcMar>
+              <w:top w:type="dxa" w:w="60"/>
+              <w:left w:type="dxa" w:w="100"/>
+              <w:bottom w:type="dxa" w:w="60"/>
+              <w:right w:type="dxa" w:w="100"/>
+            </w:tcMar>
+          </w:tcPr>
+          <w:p>
+            <w:pPr>
+              <w:spacing w:line="288"/>
+            </w:pPr>
+            <w:r>
+              <w:rPr>
+                <w:rFonts w:ascii="SimSun" w:cs="SimSun" w:eastAsia="SimSun" w:hAnsi="SimSun"/>
+                <w:color w:val="333333"/>
+                <w:sz w:val="20"/>
+                <w:szCs w:val="20"/>
+              </w:rPr>
+              <w:t xml:space="preserve">WiFi OFFLINE 双模式(被动自动嗅探/主动手动恢复) + 5次有限重试 + BOOT_WAIT提前加速 + MQTT超时保护 + 8项bug修复 + App_Network状态枚举扩展</w:t>
             </w:r>
           </w:p>
         </w:tc>

</xml_diff>

<commit_message>
docs: V4.2.4 — 更新全部内容 (CLAUDE.md + 开发指南 + 技能文件 + .docx)
</commit_message>
<xml_diff>
--- a/Claude_Files/docs/WPT无线充电系统-从零搭建全指南.docx
+++ b/Claude_Files/docs/WPT无线充电系统-从零搭建全指南.docx
@@ -288,7 +288,7 @@
                 <w:sz w:val="20"/>
                 <w:szCs w:val="20"/>
               </w:rPr>
-              <w:t xml:space="preserve">V4.2.2</w:t>
+              <w:t xml:space="preserve">V4.2.4</w:t>
             </w:r>
           </w:p>
         </w:tc>
@@ -352,7 +352,7 @@
                 <w:sz w:val="20"/>
                 <w:szCs w:val="20"/>
               </w:rPr>
-              <w:t xml:space="preserve">2026-06-17</w:t>
+              <w:t xml:space="preserve">2026-06-18</w:t>
             </w:r>
           </w:p>
         </w:tc>
@@ -416,7 +416,7 @@
                 <w:sz w:val="20"/>
                 <w:szCs w:val="20"/>
               </w:rPr>
-              <w:t xml:space="preserve">V4.2.2 (分支 `4.0TFT`)</w:t>
+              <w:t xml:space="preserve">V4.2.4 (分支 `4.0TFT`)</w:t>
             </w:r>
           </w:p>
         </w:tc>
@@ -934,7 +934,7 @@
                 <w:sz w:val="20"/>
                 <w:szCs w:val="20"/>
               </w:rPr>
-              <w:t xml:space="preserve">V4.2.2</w:t>
+              <w:t xml:space="preserve">V4.2.4</w:t>
             </w:r>
           </w:p>
         </w:tc>
@@ -965,7 +965,7 @@
                 <w:sz w:val="20"/>
                 <w:szCs w:val="20"/>
               </w:rPr>
-              <w:t xml:space="preserve">2026-06-17</w:t>
+              <w:t xml:space="preserve">2026-06-18</w:t>
             </w:r>
           </w:p>
         </w:tc>
@@ -996,7 +996,7 @@
                 <w:sz w:val="20"/>
                 <w:szCs w:val="20"/>
               </w:rPr>
-              <w:t xml:space="preserve">WiFi OFFLINE 双模式(被动自动嗅探/主动手动恢复) + 5次有限重试 + BOOT_WAIT提前加速 + MQTT超时保护 + 8项bug修复 + App_Network状态枚举扩展</w:t>
+              <w:t xml:space="preserve">离线守卫全平台修复: _isOnline 三层判定(兜底data非空→/device/detail覆写→cache延写) + Web throw误触发 + 重复代码块 + 生命周期onHide/pagehide清理 + 全平台代码审查</w:t>
             </w:r>
           </w:p>
         </w:tc>

</xml_diff>

<commit_message>
feat: V4.3.0 — W25Q128 16MB SPI Flash 全栈集成
新增:
- Hardware/W25Q_Driver.c/h: SPI1 分时复用 Flash 驱动, L1-L4 四大硬件防线
- User/App_Storage.c/h: 字库索引(Unicode直算)+参数双副本CRC32+黑匣子14B紧凑日志

修改:
- Hardware/Tft_Driver.c/h: SPI1 2Lines_FullDuplex, 字模从Flash读取, UTF-8全字库查字
- User/Sys_Core.c: Flash配置加载+ADC校准降级+SWEEP/RUNNING黑匣子记录+故障锁存
- User/App_Network.c: 黑匣子集成, 遥测S字段对齐g_sys_state
- User/main.c: W25Q_Driver_Init+App_Storage_Init 插入 INIT 阶段
- Hardware/Adc_Driver.c/h: 新增 Set_Calibration/Get_Current_Offset 公开接口

Web修复:
- ONENETapp/js/config.js: getDataModel() undefined 修复(return移出catch)
- ONENETapp/control.html: clearInterval 正确清理 _ctrlSyncTimer
- ONENETapp/index.html: _isOnline 判定改为 !falsy 统一

文档:
- Claude_Files/docs/2026-06-22-w25q128-flash-integration-design.md: 完整设计文档(10章)
- CLAUDE.md/开发指南/技能文件: V4.3.0 版本号+审查历史+行数统计+教训追加
- 全平台行数: STM32=5829, ESP=522, Web=3411, 小程序=1038 → 10800
</commit_message>
<xml_diff>
--- a/Claude_Files/docs/WPT无线充电系统-从零搭建全指南.docx
+++ b/Claude_Files/docs/WPT无线充电系统-从零搭建全指南.docx
@@ -288,7 +288,7 @@
                 <w:sz w:val="20"/>
                 <w:szCs w:val="20"/>
               </w:rPr>
-              <w:t xml:space="preserve">V4.2.4</w:t>
+              <w:t xml:space="preserve">V4.3.0</w:t>
             </w:r>
           </w:p>
         </w:tc>
@@ -352,7 +352,7 @@
                 <w:sz w:val="20"/>
                 <w:szCs w:val="20"/>
               </w:rPr>
-              <w:t xml:space="preserve">2026-06-18</w:t>
+              <w:t xml:space="preserve">2026-06-22</w:t>
             </w:r>
           </w:p>
         </w:tc>
@@ -416,7 +416,7 @@
                 <w:sz w:val="20"/>
                 <w:szCs w:val="20"/>
               </w:rPr>
-              <w:t xml:space="preserve">V4.2.4 (分支 `4.0TFT`)</w:t>
+              <w:t xml:space="preserve">V4.3.0 (分支 `4.0TFT`)</w:t>
             </w:r>
           </w:p>
         </w:tc>
@@ -902,6 +902,101 @@
                 <w:szCs w:val="20"/>
               </w:rPr>
               <w:t xml:space="preserve">全篇重构: 调试避坑模块、配图标注、双主题小程序、频率渐变斜坡、Cloudflare部署</w:t>
+            </w:r>
+          </w:p>
+        </w:tc>
+      </w:tr>
+      <w:tr>
+        <w:tc>
+          <w:tcPr>
+            <w:tcW w:type="dxa" w:w="3024"/>
+            <w:tcBorders>
+              <w:top w:val="single" w:color="CCCCCC" w:sz="1"/>
+              <w:left w:val="single" w:color="CCCCCC" w:sz="1"/>
+              <w:bottom w:val="single" w:color="CCCCCC" w:sz="1"/>
+              <w:right w:val="single" w:color="CCCCCC" w:sz="1"/>
+            </w:tcBorders>
+            <w:tcMar>
+              <w:top w:type="dxa" w:w="60"/>
+              <w:left w:type="dxa" w:w="100"/>
+              <w:bottom w:type="dxa" w:w="60"/>
+              <w:right w:type="dxa" w:w="100"/>
+            </w:tcMar>
+          </w:tcPr>
+          <w:p>
+            <w:pPr>
+              <w:spacing w:line="288"/>
+            </w:pPr>
+            <w:r>
+              <w:rPr>
+                <w:rFonts w:ascii="SimSun" w:cs="SimSun" w:eastAsia="SimSun" w:hAnsi="SimSun"/>
+                <w:color w:val="333333"/>
+                <w:sz w:val="20"/>
+                <w:szCs w:val="20"/>
+              </w:rPr>
+              <w:t xml:space="preserve">V4.3.0</w:t>
+            </w:r>
+          </w:p>
+        </w:tc>
+        <w:tc>
+          <w:tcPr>
+            <w:tcW w:type="dxa" w:w="3024"/>
+            <w:tcBorders>
+              <w:top w:val="single" w:color="CCCCCC" w:sz="1"/>
+              <w:left w:val="single" w:color="CCCCCC" w:sz="1"/>
+              <w:bottom w:val="single" w:color="CCCCCC" w:sz="1"/>
+              <w:right w:val="single" w:color="CCCCCC" w:sz="1"/>
+            </w:tcBorders>
+            <w:tcMar>
+              <w:top w:type="dxa" w:w="60"/>
+              <w:left w:type="dxa" w:w="100"/>
+              <w:bottom w:type="dxa" w:w="60"/>
+              <w:right w:type="dxa" w:w="100"/>
+            </w:tcMar>
+          </w:tcPr>
+          <w:p>
+            <w:pPr>
+              <w:spacing w:line="288"/>
+            </w:pPr>
+            <w:r>
+              <w:rPr>
+                <w:rFonts w:ascii="SimSun" w:cs="SimSun" w:eastAsia="SimSun" w:hAnsi="SimSun"/>
+                <w:color w:val="333333"/>
+                <w:sz w:val="20"/>
+                <w:szCs w:val="20"/>
+              </w:rPr>
+              <w:t xml:space="preserve">2026-06-22</w:t>
+            </w:r>
+          </w:p>
+        </w:tc>
+        <w:tc>
+          <w:tcPr>
+            <w:tcW w:type="dxa" w:w="3024"/>
+            <w:tcBorders>
+              <w:top w:val="single" w:color="CCCCCC" w:sz="1"/>
+              <w:left w:val="single" w:color="CCCCCC" w:sz="1"/>
+              <w:bottom w:val="single" w:color="CCCCCC" w:sz="1"/>
+              <w:right w:val="single" w:color="CCCCCC" w:sz="1"/>
+            </w:tcBorders>
+            <w:tcMar>
+              <w:top w:type="dxa" w:w="60"/>
+              <w:left w:type="dxa" w:w="100"/>
+              <w:bottom w:type="dxa" w:w="60"/>
+              <w:right w:type="dxa" w:w="100"/>
+            </w:tcMar>
+          </w:tcPr>
+          <w:p>
+            <w:pPr>
+              <w:spacing w:line="288"/>
+            </w:pPr>
+            <w:r>
+              <w:rPr>
+                <w:rFonts w:ascii="SimSun" w:cs="SimSun" w:eastAsia="SimSun" w:hAnsi="SimSun"/>
+                <w:color w:val="333333"/>
+                <w:sz w:val="20"/>
+                <w:szCs w:val="20"/>
+              </w:rPr>
+              <w:t xml:space="preserve">W25Q128 16MB SPI Flash 集成: SPI1 分时复用(PA6 DC/MISO动态切) + GB2312 全字库 668KB + 开机画面区 1MB + 配置参数双副本 CRC32 + 黑匣子循环日志 4MB(14B紧凑条目+跨页保护+CRC8行内校验) + 故障锁存前后5s + 四大硬件防线(L1写使能级联/L2 Busy死等/L3 DFF原子闪切/L4 发波禁擦) + ADC校准 Flash固化+自测算 B方案 + 字库上电 200ms CRC32自检 + 5帧开机动画</w:t>
             </w:r>
           </w:p>
         </w:tc>
@@ -8181,6 +8276,163 @@
                 <w:szCs w:val="20"/>
               </w:rPr>
               <w:t xml:space="preserve">¥10~20</w:t>
+            </w:r>
+          </w:p>
+        </w:tc>
+      </w:tr>
+      <w:tr>
+        <w:tc>
+          <w:tcPr>
+            <w:tcW w:type="dxa" w:w="1814"/>
+            <w:tcBorders>
+              <w:top w:val="single" w:color="CCCCCC" w:sz="1"/>
+              <w:left w:val="single" w:color="CCCCCC" w:sz="1"/>
+              <w:bottom w:val="single" w:color="CCCCCC" w:sz="1"/>
+              <w:right w:val="single" w:color="CCCCCC" w:sz="1"/>
+            </w:tcBorders>
+            <w:tcMar>
+              <w:top w:type="dxa" w:w="60"/>
+              <w:left w:type="dxa" w:w="100"/>
+              <w:bottom w:type="dxa" w:w="60"/>
+              <w:right w:type="dxa" w:w="100"/>
+            </w:tcMar>
+          </w:tcPr>
+          <w:p>
+            <w:pPr>
+              <w:spacing w:line="288"/>
+            </w:pPr>
+            <w:r>
+              <w:rPr>
+                <w:rFonts w:ascii="SimSun" w:cs="SimSun" w:eastAsia="SimSun" w:hAnsi="SimSun"/>
+                <w:color w:val="333333"/>
+                <w:sz w:val="20"/>
+                <w:szCs w:val="20"/>
+              </w:rPr>
+              <w:t xml:space="preserve">**SPI Flash**</w:t>
+            </w:r>
+          </w:p>
+        </w:tc>
+        <w:tc>
+          <w:tcPr>
+            <w:tcW w:type="dxa" w:w="1814"/>
+            <w:tcBorders>
+              <w:top w:val="single" w:color="CCCCCC" w:sz="1"/>
+              <w:left w:val="single" w:color="CCCCCC" w:sz="1"/>
+              <w:bottom w:val="single" w:color="CCCCCC" w:sz="1"/>
+              <w:right w:val="single" w:color="CCCCCC" w:sz="1"/>
+            </w:tcBorders>
+            <w:tcMar>
+              <w:top w:type="dxa" w:w="60"/>
+              <w:left w:type="dxa" w:w="100"/>
+              <w:bottom w:type="dxa" w:w="60"/>
+              <w:right w:type="dxa" w:w="100"/>
+            </w:tcMar>
+          </w:tcPr>
+          <w:p>
+            <w:pPr>
+              <w:spacing w:line="288"/>
+            </w:pPr>
+            <w:r>
+              <w:rPr>
+                <w:rFonts w:ascii="SimSun" w:cs="SimSun" w:eastAsia="SimSun" w:hAnsi="SimSun"/>
+                <w:color w:val="333333"/>
+                <w:sz w:val="20"/>
+                <w:szCs w:val="20"/>
+              </w:rPr>
+              <w:t xml:space="preserve">**W25Q128 16MB SOIC-8**</w:t>
+            </w:r>
+          </w:p>
+        </w:tc>
+        <w:tc>
+          <w:tcPr>
+            <w:tcW w:type="dxa" w:w="1814"/>
+            <w:tcBorders>
+              <w:top w:val="single" w:color="CCCCCC" w:sz="1"/>
+              <w:left w:val="single" w:color="CCCCCC" w:sz="1"/>
+              <w:bottom w:val="single" w:color="CCCCCC" w:sz="1"/>
+              <w:right w:val="single" w:color="CCCCCC" w:sz="1"/>
+            </w:tcBorders>
+            <w:tcMar>
+              <w:top w:type="dxa" w:w="60"/>
+              <w:left w:type="dxa" w:w="100"/>
+              <w:bottom w:type="dxa" w:w="60"/>
+              <w:right w:type="dxa" w:w="100"/>
+            </w:tcMar>
+          </w:tcPr>
+          <w:p>
+            <w:pPr>
+              <w:spacing w:line="288"/>
+            </w:pPr>
+            <w:r>
+              <w:rPr>
+                <w:rFonts w:ascii="SimSun" w:cs="SimSun" w:eastAsia="SimSun" w:hAnsi="SimSun"/>
+                <w:color w:val="333333"/>
+                <w:sz w:val="20"/>
+                <w:szCs w:val="20"/>
+              </w:rPr>
+              <w:t xml:space="preserve">1</w:t>
+            </w:r>
+          </w:p>
+        </w:tc>
+        <w:tc>
+          <w:tcPr>
+            <w:tcW w:type="dxa" w:w="1814"/>
+            <w:tcBorders>
+              <w:top w:val="single" w:color="CCCCCC" w:sz="1"/>
+              <w:left w:val="single" w:color="CCCCCC" w:sz="1"/>
+              <w:bottom w:val="single" w:color="CCCCCC" w:sz="1"/>
+              <w:right w:val="single" w:color="CCCCCC" w:sz="1"/>
+            </w:tcBorders>
+            <w:tcMar>
+              <w:top w:type="dxa" w:w="60"/>
+              <w:left w:type="dxa" w:w="100"/>
+              <w:bottom w:type="dxa" w:w="60"/>
+              <w:right w:type="dxa" w:w="100"/>
+            </w:tcMar>
+          </w:tcPr>
+          <w:p>
+            <w:pPr>
+              <w:spacing w:line="288"/>
+            </w:pPr>
+            <w:r>
+              <w:rPr>
+                <w:rFonts w:ascii="SimSun" w:cs="SimSun" w:eastAsia="SimSun" w:hAnsi="SimSun"/>
+                <w:color w:val="333333"/>
+                <w:sz w:val="20"/>
+                <w:szCs w:val="20"/>
+              </w:rPr>
+              <w:t xml:space="preserve">**[V4.3.0]** 外挂字库+黑匣子+参数存储</w:t>
+            </w:r>
+          </w:p>
+        </w:tc>
+        <w:tc>
+          <w:tcPr>
+            <w:tcW w:type="dxa" w:w="1814"/>
+            <w:tcBorders>
+              <w:top w:val="single" w:color="CCCCCC" w:sz="1"/>
+              <w:left w:val="single" w:color="CCCCCC" w:sz="1"/>
+              <w:bottom w:val="single" w:color="CCCCCC" w:sz="1"/>
+              <w:right w:val="single" w:color="CCCCCC" w:sz="1"/>
+            </w:tcBorders>
+            <w:tcMar>
+              <w:top w:type="dxa" w:w="60"/>
+              <w:left w:type="dxa" w:w="100"/>
+              <w:bottom w:type="dxa" w:w="60"/>
+              <w:right w:type="dxa" w:w="100"/>
+            </w:tcMar>
+          </w:tcPr>
+          <w:p>
+            <w:pPr>
+              <w:spacing w:line="288"/>
+            </w:pPr>
+            <w:r>
+              <w:rPr>
+                <w:rFonts w:ascii="SimSun" w:cs="SimSun" w:eastAsia="SimSun" w:hAnsi="SimSun"/>
+                <w:color w:val="333333"/>
+                <w:sz w:val="20"/>
+                <w:szCs w:val="20"/>
+              </w:rPr>
+              <w:t xml:space="preserve">¥3~5</w:t>
             </w:r>
           </w:p>
         </w:tc>

</xml_diff>

<commit_message>
docs: V4.5.1 — 开发指南+技能文件+README+docx 更新
- 开发指南: V4.5.0→V4.5.1, 修改日志追加安全审查修复记录
- 技能文件: 版本号更新, 审查历史追加 V4.5.1, 新增执行教训 4.11 (8条)
- README: badge+描述+版本历史表 V4.5.0→V4.5.1
- .docx 重新生成 (44KB+36KB)
</commit_message>
<xml_diff>
--- a/Claude_Files/docs/WPT无线充电系统-从零搭建全指南.docx
+++ b/Claude_Files/docs/WPT无线充电系统-从零搭建全指南.docx
@@ -288,7 +288,7 @@
                 <w:sz w:val="20"/>
                 <w:szCs w:val="20"/>
               </w:rPr>
-              <w:t xml:space="preserve">V4.5.0</w:t>
+              <w:t xml:space="preserve">V4.5.1</w:t>
             </w:r>
           </w:p>
         </w:tc>
@@ -416,7 +416,7 @@
                 <w:sz w:val="20"/>
                 <w:szCs w:val="20"/>
               </w:rPr>
-              <w:t xml:space="preserve">V4.5.0 (分支 `4.0TFT`)</w:t>
+              <w:t xml:space="preserve">V4.5.1 (分支 `4.0TFT`)</w:t>
             </w:r>
           </w:p>
         </w:tc>
@@ -807,6 +807,101 @@
                 <w:szCs w:val="20"/>
               </w:rPr>
               <w:t xml:space="preserve">变更说明</w:t>
+            </w:r>
+          </w:p>
+        </w:tc>
+      </w:tr>
+      <w:tr>
+        <w:tc>
+          <w:tcPr>
+            <w:tcW w:type="dxa" w:w="3024"/>
+            <w:tcBorders>
+              <w:top w:val="single" w:color="CCCCCC" w:sz="1"/>
+              <w:left w:val="single" w:color="CCCCCC" w:sz="1"/>
+              <w:bottom w:val="single" w:color="CCCCCC" w:sz="1"/>
+              <w:right w:val="single" w:color="CCCCCC" w:sz="1"/>
+            </w:tcBorders>
+            <w:tcMar>
+              <w:top w:type="dxa" w:w="60"/>
+              <w:left w:type="dxa" w:w="100"/>
+              <w:bottom w:type="dxa" w:w="60"/>
+              <w:right w:type="dxa" w:w="100"/>
+            </w:tcMar>
+          </w:tcPr>
+          <w:p>
+            <w:pPr>
+              <w:spacing w:line="288"/>
+            </w:pPr>
+            <w:r>
+              <w:rPr>
+                <w:rFonts w:ascii="SimSun" w:cs="SimSun" w:eastAsia="SimSun" w:hAnsi="SimSun"/>
+                <w:color w:val="333333"/>
+                <w:sz w:val="20"/>
+                <w:szCs w:val="20"/>
+              </w:rPr>
+              <w:t xml:space="preserve">V4.5.1</w:t>
+            </w:r>
+          </w:p>
+        </w:tc>
+        <w:tc>
+          <w:tcPr>
+            <w:tcW w:type="dxa" w:w="3024"/>
+            <w:tcBorders>
+              <w:top w:val="single" w:color="CCCCCC" w:sz="1"/>
+              <w:left w:val="single" w:color="CCCCCC" w:sz="1"/>
+              <w:bottom w:val="single" w:color="CCCCCC" w:sz="1"/>
+              <w:right w:val="single" w:color="CCCCCC" w:sz="1"/>
+            </w:tcBorders>
+            <w:tcMar>
+              <w:top w:type="dxa" w:w="60"/>
+              <w:left w:type="dxa" w:w="100"/>
+              <w:bottom w:type="dxa" w:w="60"/>
+              <w:right w:type="dxa" w:w="100"/>
+            </w:tcMar>
+          </w:tcPr>
+          <w:p>
+            <w:pPr>
+              <w:spacing w:line="288"/>
+            </w:pPr>
+            <w:r>
+              <w:rPr>
+                <w:rFonts w:ascii="SimSun" w:cs="SimSun" w:eastAsia="SimSun" w:hAnsi="SimSun"/>
+                <w:color w:val="333333"/>
+                <w:sz w:val="20"/>
+                <w:szCs w:val="20"/>
+              </w:rPr>
+              <w:t xml:space="preserve">2026-07-02</w:t>
+            </w:r>
+          </w:p>
+        </w:tc>
+        <w:tc>
+          <w:tcPr>
+            <w:tcW w:type="dxa" w:w="3024"/>
+            <w:tcBorders>
+              <w:top w:val="single" w:color="CCCCCC" w:sz="1"/>
+              <w:left w:val="single" w:color="CCCCCC" w:sz="1"/>
+              <w:bottom w:val="single" w:color="CCCCCC" w:sz="1"/>
+              <w:right w:val="single" w:color="CCCCCC" w:sz="1"/>
+            </w:tcBorders>
+            <w:tcMar>
+              <w:top w:type="dxa" w:w="60"/>
+              <w:left w:type="dxa" w:w="100"/>
+              <w:bottom w:type="dxa" w:w="60"/>
+              <w:right w:type="dxa" w:w="100"/>
+            </w:tcMar>
+          </w:tcPr>
+          <w:p>
+            <w:pPr>
+              <w:spacing w:line="288"/>
+            </w:pPr>
+            <w:r>
+              <w:rPr>
+                <w:rFonts w:ascii="SimSun" w:cs="SimSun" w:eastAsia="SimSun" w:hAnsi="SimSun"/>
+                <w:color w:val="333333"/>
+                <w:sz w:val="20"/>
+                <w:szCs w:val="20"/>
+              </w:rPr>
+              <w:t xml:space="preserve">**全平台安全审查修复 (16项)**: ESP8266 Token占位符化+配网密码+CMD:CLEAR二次确认+公共MQTT门控 + STM32 DMA超时护底+环形缓冲+黑匣子指针持久化+故障锁存跨页擦除+strtol防溢出+USART2 RXNE优先 + 扫频进度条防闪烁 + Web乐观缓存回滚+SW BASE路径修复</w:t>
             </w:r>
           </w:p>
         </w:tc>

</xml_diff>

<commit_message>
fix: complete V5.1.2 full-stack optimization
</commit_message>
<xml_diff>
--- a/Claude_Files/docs/WPT无线充电系统-从零搭建全指南.docx
+++ b/Claude_Files/docs/WPT无线充电系统-从零搭建全指南.docx
@@ -50,7 +50,7 @@
           <w:sz w:val="24"/>
           <w:szCs w:val="24"/>
         </w:rPr>
-        <w:t xml:space="preserve">版本 V5.1.0</w:t>
+        <w:t xml:space="preserve">版本 V5.1.2</w:t>
       </w:r>
     </w:p>
     <w:p>
@@ -305,7 +305,7 @@
                 <w:sz w:val="20"/>
                 <w:szCs w:val="20"/>
               </w:rPr>
-              <w:t xml:space="preserve">V5.1.0</w:t>
+              <w:t xml:space="preserve">V5.1.2</w:t>
             </w:r>
           </w:p>
         </w:tc>
@@ -433,7 +433,7 @@
                 <w:sz w:val="20"/>
                 <w:szCs w:val="20"/>
               </w:rPr>
-              <w:t xml:space="preserve">V5.1.0 (分支 `5.0`)</w:t>
+              <w:t xml:space="preserve">V5.1.2 (分支 `5.0`)</w:t>
             </w:r>
           </w:p>
         </w:tc>
@@ -856,6 +856,196 @@
                 <w:sz w:val="20"/>
                 <w:szCs w:val="20"/>
               </w:rPr>
+              <w:t xml:space="preserve">V5.1.2</w:t>
+            </w:r>
+          </w:p>
+        </w:tc>
+        <w:tc>
+          <w:tcPr>
+            <w:tcW w:type="dxa" w:w="3024"/>
+            <w:tcBorders>
+              <w:top w:val="single" w:color="CCCCCC" w:sz="1"/>
+              <w:left w:val="single" w:color="CCCCCC" w:sz="1"/>
+              <w:bottom w:val="single" w:color="CCCCCC" w:sz="1"/>
+              <w:right w:val="single" w:color="CCCCCC" w:sz="1"/>
+            </w:tcBorders>
+            <w:tcMar>
+              <w:top w:type="dxa" w:w="60"/>
+              <w:left w:type="dxa" w:w="100"/>
+              <w:bottom w:type="dxa" w:w="60"/>
+              <w:right w:type="dxa" w:w="100"/>
+            </w:tcMar>
+          </w:tcPr>
+          <w:p>
+            <w:pPr>
+              <w:spacing w:line="288"/>
+            </w:pPr>
+            <w:r>
+              <w:rPr>
+                <w:rFonts w:ascii="SimSun" w:cs="SimSun" w:eastAsia="SimSun" w:hAnsi="SimSun"/>
+                <w:color w:val="333333"/>
+                <w:sz w:val="20"/>
+                <w:szCs w:val="20"/>
+              </w:rPr>
+              <w:t xml:space="preserve">2026-07-26</w:t>
+            </w:r>
+          </w:p>
+        </w:tc>
+        <w:tc>
+          <w:tcPr>
+            <w:tcW w:type="dxa" w:w="3024"/>
+            <w:tcBorders>
+              <w:top w:val="single" w:color="CCCCCC" w:sz="1"/>
+              <w:left w:val="single" w:color="CCCCCC" w:sz="1"/>
+              <w:bottom w:val="single" w:color="CCCCCC" w:sz="1"/>
+              <w:right w:val="single" w:color="CCCCCC" w:sz="1"/>
+            </w:tcBorders>
+            <w:tcMar>
+              <w:top w:type="dxa" w:w="60"/>
+              <w:left w:type="dxa" w:w="100"/>
+              <w:bottom w:type="dxa" w:w="60"/>
+              <w:right w:type="dxa" w:w="100"/>
+            </w:tcMar>
+          </w:tcPr>
+          <w:p>
+            <w:pPr>
+              <w:spacing w:line="288"/>
+            </w:pPr>
+            <w:r>
+              <w:rPr>
+                <w:rFonts w:ascii="SimSun" w:cs="SimSun" w:eastAsia="SimSun" w:hAnsi="SimSun"/>
+                <w:color w:val="333333"/>
+                <w:sz w:val="20"/>
+                <w:szCs w:val="20"/>
+              </w:rPr>
+              <w:t xml:space="preserve">**全链路优化**: ESP8266双档频率量化、指令精确匹配与串口溢出保护；小程序/网页数据模型迁移、轮询恢复与跨日历史修复；桥接鉴权与输入验证；字库工具新备份、完整2MB校验和分区写入。</w:t>
+            </w:r>
+          </w:p>
+        </w:tc>
+      </w:tr>
+      <w:tr>
+        <w:tc>
+          <w:tcPr>
+            <w:tcW w:type="dxa" w:w="3024"/>
+            <w:tcBorders>
+              <w:top w:val="single" w:color="CCCCCC" w:sz="1"/>
+              <w:left w:val="single" w:color="CCCCCC" w:sz="1"/>
+              <w:bottom w:val="single" w:color="CCCCCC" w:sz="1"/>
+              <w:right w:val="single" w:color="CCCCCC" w:sz="1"/>
+            </w:tcBorders>
+            <w:tcMar>
+              <w:top w:type="dxa" w:w="60"/>
+              <w:left w:type="dxa" w:w="100"/>
+              <w:bottom w:type="dxa" w:w="60"/>
+              <w:right w:type="dxa" w:w="100"/>
+            </w:tcMar>
+          </w:tcPr>
+          <w:p>
+            <w:pPr>
+              <w:spacing w:line="288"/>
+            </w:pPr>
+            <w:r>
+              <w:rPr>
+                <w:rFonts w:ascii="SimSun" w:cs="SimSun" w:eastAsia="SimSun" w:hAnsi="SimSun"/>
+                <w:color w:val="333333"/>
+                <w:sz w:val="20"/>
+                <w:szCs w:val="20"/>
+              </w:rPr>
+              <w:t xml:space="preserve">V5.1.1</w:t>
+            </w:r>
+          </w:p>
+        </w:tc>
+        <w:tc>
+          <w:tcPr>
+            <w:tcW w:type="dxa" w:w="3024"/>
+            <w:tcBorders>
+              <w:top w:val="single" w:color="CCCCCC" w:sz="1"/>
+              <w:left w:val="single" w:color="CCCCCC" w:sz="1"/>
+              <w:bottom w:val="single" w:color="CCCCCC" w:sz="1"/>
+              <w:right w:val="single" w:color="CCCCCC" w:sz="1"/>
+            </w:tcBorders>
+            <w:tcMar>
+              <w:top w:type="dxa" w:w="60"/>
+              <w:left w:type="dxa" w:w="100"/>
+              <w:bottom w:type="dxa" w:w="60"/>
+              <w:right w:type="dxa" w:w="100"/>
+            </w:tcMar>
+          </w:tcPr>
+          <w:p>
+            <w:pPr>
+              <w:spacing w:line="288"/>
+            </w:pPr>
+            <w:r>
+              <w:rPr>
+                <w:rFonts w:ascii="SimSun" w:cs="SimSun" w:eastAsia="SimSun" w:hAnsi="SimSun"/>
+                <w:color w:val="333333"/>
+                <w:sz w:val="20"/>
+                <w:szCs w:val="20"/>
+              </w:rPr>
+              <w:t xml:space="preserve">2026-07-26</w:t>
+            </w:r>
+          </w:p>
+        </w:tc>
+        <w:tc>
+          <w:tcPr>
+            <w:tcW w:type="dxa" w:w="3024"/>
+            <w:tcBorders>
+              <w:top w:val="single" w:color="CCCCCC" w:sz="1"/>
+              <w:left w:val="single" w:color="CCCCCC" w:sz="1"/>
+              <w:bottom w:val="single" w:color="CCCCCC" w:sz="1"/>
+              <w:right w:val="single" w:color="CCCCCC" w:sz="1"/>
+            </w:tcBorders>
+            <w:tcMar>
+              <w:top w:type="dxa" w:w="60"/>
+              <w:left w:type="dxa" w:w="100"/>
+              <w:bottom w:type="dxa" w:w="60"/>
+              <w:right w:type="dxa" w:w="100"/>
+            </w:tcMar>
+          </w:tcPr>
+          <w:p>
+            <w:pPr>
+              <w:spacing w:line="288"/>
+            </w:pPr>
+            <w:r>
+              <w:rPr>
+                <w:rFonts w:ascii="SimSun" w:cs="SimSun" w:eastAsia="SimSun" w:hAnsi="SimSun"/>
+                <w:color w:val="333333"/>
+                <w:sz w:val="20"/>
+                <w:szCs w:val="20"/>
+              </w:rPr>
+              <w:t xml:space="preserve">**全面加固**: 主题擦除和配色越界修复；外置图标动态布局；字库V2全负载CRC；整帧命令解析；配置语义校验；200ms上电稳定门控；ADC模拟看门狗快速关断；异常最小化关断；实际频率跟踪与2KB栈。</w:t>
+            </w:r>
+          </w:p>
+        </w:tc>
+      </w:tr>
+      <w:tr>
+        <w:tc>
+          <w:tcPr>
+            <w:tcW w:type="dxa" w:w="3024"/>
+            <w:tcBorders>
+              <w:top w:val="single" w:color="CCCCCC" w:sz="1"/>
+              <w:left w:val="single" w:color="CCCCCC" w:sz="1"/>
+              <w:bottom w:val="single" w:color="CCCCCC" w:sz="1"/>
+              <w:right w:val="single" w:color="CCCCCC" w:sz="1"/>
+            </w:tcBorders>
+            <w:tcMar>
+              <w:top w:type="dxa" w:w="60"/>
+              <w:left w:type="dxa" w:w="100"/>
+              <w:bottom w:type="dxa" w:w="60"/>
+              <w:right w:type="dxa" w:w="100"/>
+            </w:tcMar>
+          </w:tcPr>
+          <w:p>
+            <w:pPr>
+              <w:spacing w:line="288"/>
+            </w:pPr>
+            <w:r>
+              <w:rPr>
+                <w:rFonts w:ascii="SimSun" w:cs="SimSun" w:eastAsia="SimSun" w:hAnsi="SimSun"/>
+                <w:color w:val="333333"/>
+                <w:sz w:val="20"/>
+                <w:szCs w:val="20"/>
+              </w:rPr>
               <w:t xml:space="preserve">V5.1.0</w:t>
             </w:r>
           </w:p>
@@ -2311,7 +2501,8 @@
           <w:sz w:val="22"/>
           <w:szCs w:val="22"/>
         </w:rPr>
-        <w:t xml:space="preserve">- 远程调频率 (20kHz~200kHz, 步进到实际可达值)</w:t>
+        <w:t xml:space="preserve">- 远程调频率 (20kHz~200kHz, 步进到实际可达值)
+</w:t>
       </w:r>
     </w:p>
     <w:p>
@@ -2325,7 +2516,8 @@
           <w:sz w:val="22"/>
           <w:szCs w:val="22"/>
         </w:rPr>
-        <w:t xml:space="preserve">- TFT 彩屏本地显示: 递增式分段表盘 + 15页面 UI</w:t>
+        <w:t xml:space="preserve">- TFT 彩屏本地显示: 递增式分段表盘 + 15页面 UI
+</w:t>
       </w:r>
     </w:p>
     <w:p>
@@ -2798,7 +2990,8 @@
           <w:sz w:val="19"/>
           <w:szCs w:val="19"/>
         </w:rPr>
-        <w:t xml:space="preserve">│  • TIM1全桥PWM (20k~200kHz, 50%占空比, 1000ns死区)   │</w:t>
+        <w:t xml:space="preserve">│  • TIM1全桥PWM (20k~200kHz, 50%占空比, 1000ns死区)   │
+</w:t>
       </w:r>
     </w:p>
     <w:p>
@@ -14178,7 +14371,8 @@
           <w:sz w:val="19"/>
           <w:szCs w:val="19"/>
         </w:rPr>
-        <w:t xml:space="preserve">│   ├── Ui_Controller.c/h   ← 15页面 UI 状态机 + 五项设置 + 递增式独立表盘</w:t>
+        <w:t xml:space="preserve">│   ├── Ui_Controller.c/h   ← 15页面 UI 状态机 + 五项设置 + 递增式独立表盘
+</w:t>
       </w:r>
     </w:p>
     <w:p>
@@ -14194,8 +14388,7 @@
           <w:sz w:val="19"/>
           <w:szCs w:val="19"/>
         </w:rPr>
-        <w:t xml:space="preserve">│   ├── Tft_Driver.c/h      ← ST7735 SPI+DMA + Flash/ROM 双路径字库
-</w:t>
+        <w:t xml:space="preserve">│   ├── Tft_Driver.c/h      ← ST7735 SPI+DMA + Flash/ROM 双路径字库 + V2全负载CRC</w:t>
       </w:r>
     </w:p>
     <w:p>
@@ -14296,8 +14489,7 @@
           <w:sz w:val="19"/>
           <w:szCs w:val="19"/>
         </w:rPr>
-        <w:t xml:space="preserve">│   ├── Adc_Driver.c/h      ← TIM3 500Hz触发 + 64点显示/8点安全窗口
-</w:t>
+        <w:t xml:space="preserve">│   ├── Adc_Driver.c/h      ← TIM3 500Hz触发 + 模拟看门狗 + 64点显示/8点安全窗口</w:t>
       </w:r>
     </w:p>
     <w:p>
@@ -14364,7 +14556,8 @@
           <w:sz w:val="19"/>
           <w:szCs w:val="19"/>
         </w:rPr>
-        <w:t xml:space="preserve">│   ├── Pwm_Driver.c/h      ← TIM1 全桥 PWM 20-200kHz原子更新</w:t>
+        <w:t xml:space="preserve">│   ├── Pwm_Driver.c/h      ← TIM1 全桥 PWM 20-200kHz原子更新
+</w:t>
       </w:r>
     </w:p>
     <w:p>
@@ -14482,8 +14675,7 @@
           <w:sz w:val="19"/>
           <w:szCs w:val="19"/>
         </w:rPr>
-        <w:t xml:space="preserve">│   └── stm32f10x_it.c/h    ← SysTick/ADC DMA/USART2 ISR
-</w:t>
+        <w:t xml:space="preserve">│   └── stm32f10x_it.c/h    ← SysTick/ADC看门狗/ADC DMA/USART2 ISR</w:t>
       </w:r>
     </w:p>
     <w:p>
@@ -15174,7 +15366,8 @@
           <w:sz w:val="19"/>
           <w:szCs w:val="19"/>
         </w:rPr>
-        <w:t xml:space="preserve">SS_IDLE ──Trigger──→ SS_SWEEP(按锁定档位起点) ──降频──→ SS_DONE(保存目标)</w:t>
+        <w:t xml:space="preserve">SS_IDLE ──Trigger──→ SS_SWEEP(按锁定档位起点) ──降频──→ SS_DONE(保存目标)
+</w:t>
       </w:r>
     </w:p>
     <w:p>
@@ -15277,7 +15470,8 @@
           <w:sz w:val="22"/>
           <w:szCs w:val="22"/>
         </w:rPr>
-        <w:t xml:space="preserve">——扫频时 TFT 照刷、按键照样响应、过流保护照样生效。</w:t>
+        <w:t xml:space="preserve">——扫频时 TFT 照刷、按键照样响应、过流保护照样生效。
+</w:t>
       </w:r>
     </w:p>
     <w:p/>
@@ -15292,7 +15486,8 @@
           <w:sz w:val="22"/>
           <w:szCs w:val="22"/>
         </w:rPr>
-        <w:t xml:space="preserve">PWM统一硬边界为20–200kHz；功率级允许工作范围仍须由实机谐振参数、限流条件和温升测试确认。</w:t>
+        <w:t xml:space="preserve">PWM统一硬边界为20–200kHz；功率级允许工作范围仍须由实机谐振参数、限流条件和温升测试确认。
+</w:t>
       </w:r>
     </w:p>
     <w:p/>
@@ -16302,8 +16497,7 @@
           <w:sz w:val="22"/>
           <w:szCs w:val="22"/>
         </w:rPr>
-        <w:t xml:space="preserve">: 仅IDLE、PB10已开、ADC校准READY、采样新鲜且无FAULT时允许KEY4/远程ON启动
-</w:t>
+        <w:t xml:space="preserve">: 仅IDLE、PB10已稳定接通至少200ms、ADC校准READY、采样新鲜、电流安全且无FAULT时允许KEY4/远程ON启动</w:t>
       </w:r>
     </w:p>
     <w:p>
@@ -16337,8 +16531,7 @@
           <w:sz w:val="22"/>
           <w:szCs w:val="22"/>
         </w:rPr>
-        <w:t xml:space="preserve">: SWEEP和RUNNING都使用8点安全电流，连续3个新样本 &gt;5.0A才锁存FAULT
-</w:t>
+        <w:t xml:space="preserve">: ADC模拟看门狗在约5.5A门限先关闭PWM；SWEEP和RUNNING继续使用8点安全电流，连续3个新样本 &gt;5.0A锁存FAULT，形成快速关断与抗干扰确认两层保护</w:t>
       </w:r>
     </w:p>
     <w:p>
@@ -16372,8 +16565,28 @@
           <w:sz w:val="22"/>
           <w:szCs w:val="22"/>
         </w:rPr>
-        <w:t xml:space="preserve">: 首故障原因锁存并冻结故障快照；PWM与12V强制关闭，KEY0不能绕过FAULT
-</w:t>
+        <w:t xml:space="preserve">: 首故障原因锁存并冻结故障快照；PWM与12V强制关闭，KEY0不能绕过FAULT</w:t>
+      </w:r>
+    </w:p>
+    <w:p/>
+    <w:p>
+      <w:pPr>
+        <w:pBdr>
+          <w:left w:val="single" w:color="2B579A" w:sz="12" w:space="8"/>
+        </w:pBdr>
+        <w:spacing w:line="360"/>
+        <w:ind w:left="360"/>
+      </w:pPr>
+      <w:r>
+        <w:rPr>
+          <w:rFonts w:ascii="SimSun" w:cs="SimSun" w:eastAsia="SimSun" w:hAnsi="SimSun"/>
+          <w:i/>
+          <w:iCs/>
+          <w:color w:val="555555"/>
+          <w:sz w:val="20"/>
+          <w:szCs w:val="20"/>
+        </w:rPr>
+        <w:t xml:space="preserve">ADC模拟看门狗受500Hz采样周期限制，属于毫秒级快速软件保护，不能替代功率板上的硬件比较器、驱动器关断脚和保险丝。MOSFET逐周期保护仍应由外部硬件完成。</w:t>
       </w:r>
     </w:p>
     <w:p/>
@@ -16725,7 +16938,7 @@
                 <w:sz w:val="20"/>
                 <w:szCs w:val="20"/>
               </w:rPr>
-              <w:t xml:space="preserve">W25Q128全字库20897字；ROM回退为ASCII 95字 + 必要中文4字 + 图标</w:t>
+              <w:t xml:space="preserve">W25Q128全字库20897字；V2 CRC覆盖完整有效负载并兼容V1；ROM回退为ASCII 95字 + 必要中文4字 + 图标</w:t>
             </w:r>
           </w:p>
         </w:tc>
@@ -16853,7 +17066,7 @@
                 <w:sz w:val="20"/>
                 <w:szCs w:val="20"/>
               </w:rPr>
-              <w:t xml:space="preserve">WIFI(4帧+动画6帧), MQTT(3态+动画6帧), ICON_STAR</w:t>
+              <w:t xml:space="preserve">35组78帧；数据起点按表头条目数动态计算，片内保留WIFI/MQTT/星形回退</w:t>
             </w:r>
           </w:p>
         </w:tc>
@@ -16936,7 +17149,8 @@
           <w:sz w:val="22"/>
           <w:szCs w:val="22"/>
         </w:rPr>
-        <w:t xml:space="preserve">#### 4.3.9 UI — 15页面五项设置 + 递增式独立表盘</w:t>
+        <w:t xml:space="preserve">#### 4.3.9 UI — 15页面五项设置 + 递增式独立表盘
+</w:t>
       </w:r>
     </w:p>
     <w:p/>
@@ -18620,7 +18834,7 @@
           <w:sz w:val="22"/>
           <w:szCs w:val="22"/>
         </w:rPr>
-        <w:t xml:space="preserve">: 语言、启动频率、字符间距、光标图标、配色方案。启动频率页保存低频档20.0–99.9kHz与高频档100–200kHz；确认保存副本，返回取消本次编辑，KEY1双击从任意设置子页回主菜单。PA12背光保留GPIO开关能力，不提供设置项。</w:t>
+        <w:t xml:space="preserve">: 语言、启动频率、字符间距、光标图标、配色方案。启动频率页保存低频档20.0–99.9kHz与高频档100–200kHz；确认保存副本，返回取消本次编辑，KEY1双击从任意设置子页回主菜单。配色页以每行色块显示六种预设，不再覆盖末行选项；自定义配色进入预览时使用安全下标。PA12背光保留GPIO开关能力，不提供设置项。</w:t>
       </w:r>
     </w:p>
     <w:p/>
@@ -18655,7 +18869,8 @@
           <w:sz w:val="22"/>
           <w:szCs w:val="22"/>
         </w:rPr>
-        <w:t xml:space="preserve">: 电压按0–20V/2V、20–40V/5V、40–50V/10V分段；电流按0–1A/0.1A、1–3A/0.5A、3–5A/1A分段；频率随锁定档位使用20–50/5、50–80/10、80–100/20kHz或100–140/5、140–180/10、180–200/20kHz分段。每格角度相同，跨分段连续；中央主数值由8×16字模2倍绘制，动态周期仅差分刷新圆弧、数值和状态。</w:t>
+        <w:t xml:space="preserve">: 电压按0–20V/2V、20–40V/5V、40–50V/10V分段；电流按0–1A/0.1A、1–3A/0.5A、3–5A/1A分段；频率随锁定档位使用20–50/5、50–80/10、80–100/20kHz或100–140/5、140–180/10、180–200/20kHz分段。每格角度相同，跨分段连续；中央主数值由8×16字模2倍绘制，动态周期仅差分刷新圆弧、数值和状态。
+</w:t>
       </w:r>
     </w:p>
     <w:p/>
@@ -23723,8 +23938,7 @@
           <w:sz w:val="22"/>
           <w:szCs w:val="22"/>
         </w:rPr>
-        <w:t xml:space="preserve">: `(val/1000)*1000`, 与 STM32 PWM 1kHz 步进一致。
-</w:t>
+        <w:t xml:space="preserve">: 20.0–99.9kHz按100Hz量化，100–200kHz按1kHz量化；运行期再由STM32以1kHz/10ms平滑过渡到精确目标。</w:t>
       </w:r>
     </w:p>
     <w:p/>
@@ -23759,8 +23973,7 @@
           <w:sz w:val="22"/>
           <w:szCs w:val="22"/>
         </w:rPr>
-        <w:t xml:space="preserve">: 仅在 running 时上报真实 F 值, 否则上报 0。完全透传 STM32 决策。
-</w:t>
+        <w:t xml:space="preserve">: SWEEP和RUNNING上报TIM1实际 F 值，IDLE和FAULT上报0；ESP8266完全透传STM32决策。</w:t>
       </w:r>
     </w:p>
     <w:p/>
@@ -30641,6 +30854,134 @@
                 <w:sz w:val="20"/>
                 <w:szCs w:val="20"/>
               </w:rPr>
+              <w:t xml:space="preserve">V5.1.2</w:t>
+            </w:r>
+          </w:p>
+        </w:tc>
+        <w:tc>
+          <w:tcPr>
+            <w:tcW w:type="dxa" w:w="4536"/>
+            <w:tcBorders>
+              <w:top w:val="single" w:color="CCCCCC" w:sz="1"/>
+              <w:left w:val="single" w:color="CCCCCC" w:sz="1"/>
+              <w:bottom w:val="single" w:color="CCCCCC" w:sz="1"/>
+              <w:right w:val="single" w:color="CCCCCC" w:sz="1"/>
+            </w:tcBorders>
+            <w:tcMar>
+              <w:top w:type="dxa" w:w="60"/>
+              <w:left w:type="dxa" w:w="100"/>
+              <w:bottom w:type="dxa" w:w="60"/>
+              <w:right w:type="dxa" w:w="100"/>
+            </w:tcMar>
+          </w:tcPr>
+          <w:p>
+            <w:pPr>
+              <w:spacing w:line="288"/>
+            </w:pPr>
+            <w:r>
+              <w:rPr>
+                <w:rFonts w:ascii="SimSun" w:cs="SimSun" w:eastAsia="SimSun" w:hAnsi="SimSun"/>
+                <w:color w:val="333333"/>
+                <w:sz w:val="20"/>
+                <w:szCs w:val="20"/>
+              </w:rPr>
+              <w:t xml:space="preserve">ESP8266、小程序、网页、桥接与CH341A工具的频率、安全、生命周期和数据一致性修复。</w:t>
+            </w:r>
+          </w:p>
+        </w:tc>
+      </w:tr>
+      <w:tr>
+        <w:tc>
+          <w:tcPr>
+            <w:tcW w:type="dxa" w:w="4536"/>
+            <w:tcBorders>
+              <w:top w:val="single" w:color="CCCCCC" w:sz="1"/>
+              <w:left w:val="single" w:color="CCCCCC" w:sz="1"/>
+              <w:bottom w:val="single" w:color="CCCCCC" w:sz="1"/>
+              <w:right w:val="single" w:color="CCCCCC" w:sz="1"/>
+            </w:tcBorders>
+            <w:tcMar>
+              <w:top w:type="dxa" w:w="60"/>
+              <w:left w:type="dxa" w:w="100"/>
+              <w:bottom w:type="dxa" w:w="60"/>
+              <w:right w:type="dxa" w:w="100"/>
+            </w:tcMar>
+          </w:tcPr>
+          <w:p>
+            <w:pPr>
+              <w:spacing w:line="288"/>
+            </w:pPr>
+            <w:r>
+              <w:rPr>
+                <w:rFonts w:ascii="SimSun" w:cs="SimSun" w:eastAsia="SimSun" w:hAnsi="SimSun"/>
+                <w:color w:val="333333"/>
+                <w:sz w:val="20"/>
+                <w:szCs w:val="20"/>
+              </w:rPr>
+              <w:t xml:space="preserve">V5.1.1</w:t>
+            </w:r>
+          </w:p>
+        </w:tc>
+        <w:tc>
+          <w:tcPr>
+            <w:tcW w:type="dxa" w:w="4536"/>
+            <w:tcBorders>
+              <w:top w:val="single" w:color="CCCCCC" w:sz="1"/>
+              <w:left w:val="single" w:color="CCCCCC" w:sz="1"/>
+              <w:bottom w:val="single" w:color="CCCCCC" w:sz="1"/>
+              <w:right w:val="single" w:color="CCCCCC" w:sz="1"/>
+            </w:tcBorders>
+            <w:tcMar>
+              <w:top w:type="dxa" w:w="60"/>
+              <w:left w:type="dxa" w:w="100"/>
+              <w:bottom w:type="dxa" w:w="60"/>
+              <w:right w:type="dxa" w:w="100"/>
+            </w:tcMar>
+          </w:tcPr>
+          <w:p>
+            <w:pPr>
+              <w:spacing w:line="288"/>
+            </w:pPr>
+            <w:r>
+              <w:rPr>
+                <w:rFonts w:ascii="SimSun" w:cs="SimSun" w:eastAsia="SimSun" w:hAnsi="SimSun"/>
+                <w:color w:val="333333"/>
+                <w:sz w:val="20"/>
+                <w:szCs w:val="20"/>
+              </w:rPr>
+              <w:t xml:space="preserve">显示、图标、字库、配置和命令边界修复；200ms上电门控；ADC模拟看门狗快速关断；异常安全路径与实际频率跟踪。</w:t>
+            </w:r>
+          </w:p>
+        </w:tc>
+      </w:tr>
+      <w:tr>
+        <w:tc>
+          <w:tcPr>
+            <w:tcW w:type="dxa" w:w="4536"/>
+            <w:tcBorders>
+              <w:top w:val="single" w:color="CCCCCC" w:sz="1"/>
+              <w:left w:val="single" w:color="CCCCCC" w:sz="1"/>
+              <w:bottom w:val="single" w:color="CCCCCC" w:sz="1"/>
+              <w:right w:val="single" w:color="CCCCCC" w:sz="1"/>
+            </w:tcBorders>
+            <w:tcMar>
+              <w:top w:type="dxa" w:w="60"/>
+              <w:left w:type="dxa" w:w="100"/>
+              <w:bottom w:type="dxa" w:w="60"/>
+              <w:right w:type="dxa" w:w="100"/>
+            </w:tcMar>
+          </w:tcPr>
+          <w:p>
+            <w:pPr>
+              <w:spacing w:line="288"/>
+            </w:pPr>
+            <w:r>
+              <w:rPr>
+                <w:rFonts w:ascii="SimSun" w:cs="SimSun" w:eastAsia="SimSun" w:hAnsi="SimSun"/>
+                <w:color w:val="333333"/>
+                <w:sz w:val="20"/>
+                <w:szCs w:val="20"/>
+              </w:rPr>
               <w:t xml:space="preserve">V5.1.0</w:t>
             </w:r>
           </w:p>
@@ -30961,7 +31302,7 @@
           <w:sz w:val="20"/>
           <w:szCs w:val="20"/>
         </w:rPr>
-        <w:t xml:space="preserve">**全文完**。本文已与 V5.1.0 固件同步。如果你跟着做遇到问题, 回头翻第 9 章故障速查表；涉及功率部分时务必先断开12V并确认PB10为低。祝你的全桥不发烫, ESP8266 不掉线, OneNET 不报401, TFT不显示乱码。</w:t>
+        <w:t xml:space="preserve">**全文完**。本文已与 V5.1.2 固件同步。如果你跟着做遇到问题, 回头翻第 9 章故障速查表；涉及功率部分时务必先断开12V并确认PB10为低。祝你的全桥不发烫, ESP8266 不掉线, OneNET 不报401, TFT不显示乱码。</w:t>
       </w:r>
     </w:p>
     <w:p/>

</xml_diff>